<commit_message>
Student Handbook V2 and Reading Packs V3 for the two-level plan
- Handbook: Intermediate (16) and Advanced (12) session tables, new graded-work dates,
  two certificates, severity moved to the Advanced memo, self-study FAQ
- Reading Packs: 7 packs in session order (Intermediate Weeks 1-4, Advanced Weeks 1-3),
  reusing each Book's existing reading text; Books 33/34/35/40 restored from the retired pack;
  20-session packs moved to _retired-20-session-plan
- Trainee User Guide: folder table points at the new packs

Co-Authored-By: Claude Opus 5.5 <noreply@anthropic.com>
Claude-Session: https://claude.ai/code/session_018fWq9UNCNi5rGqwUiTA1Zk
</commit_message>
<xml_diff>
--- a/materials/00-start-here/Student-Handbook-START-HERE.docx
+++ b/materials/00-start-here/Student-Handbook-START-HERE.docx
@@ -274,7 +274,7 @@
                 <w:sz w:val="19"/>
                 <w:szCs w:val="19"/>
               </w:rPr>
-              <w:t xml:space="preserve">Course 1 — The Full Sweep (live SAP SOX/ITGC cohort)</w:t>
+              <w:t>Course 1 — The Full Sweep (SAP SOX/ITGC) · live cohort or self-study</w:t>
             </w:r>
           </w:p>
         </w:tc>
@@ -343,7 +343,7 @@
                 <w:sz w:val="19"/>
                 <w:szCs w:val="19"/>
               </w:rPr>
-              <w:t xml:space="preserve">V1 — October 2026 restructure</w:t>
+              <w:t>V2 — October 2026 · two-level plan (Intermediate + Advanced)</w:t>
             </w:r>
           </w:p>
         </w:tc>
@@ -554,7 +554,7 @@
                 <w:sz w:val="19"/>
                 <w:szCs w:val="19"/>
               </w:rPr>
-              <w:t xml:space="preserve">Student Handbook (Mon/Wed/Fri module format)</w:t>
+              <w:t>Student Handbook V1 (20-session plan)</w:t>
             </w:r>
           </w:p>
         </w:tc>
@@ -1584,7 +1584,7 @@
                 <w:sz w:val="19"/>
                 <w:szCs w:val="19"/>
               </w:rPr>
-              <w:t xml:space="preserve">One trainee presents the conclusion and the facilitator pushes back as a reviewer would. You do this four times</w:t>
+              <w:t>One trainee presents the conclusion and the facilitator pushes back as a reviewer would. Everyone takes turns across each level</w:t>
             </w:r>
           </w:p>
         </w:tc>
@@ -1654,6 +1654,75 @@
                 <w:szCs w:val="19"/>
               </w:rPr>
               <w:t xml:space="preserve">You repeat the full walkthrough yourself and upload your evidence in the app</w:t>
+            </w:r>
+          </w:p>
+        </w:tc>
+      </w:tr>
+      <w:tr>
+        <w:trPr>
+          <w:cantSplit/>
+        </w:trPr>
+        <w:tc>
+          <w:tcPr>
+            <w:tcW w:type="dxa" w:w="2600"/>
+            <w:tcBorders>
+              <w:top w:val="single" w:color="D5DCE6" w:sz="4"/>
+              <w:left w:val="single" w:color="D5DCE6" w:sz="4"/>
+              <w:bottom w:val="single" w:color="D5DCE6" w:sz="4"/>
+              <w:right w:val="single" w:color="D5DCE6" w:sz="4"/>
+            </w:tcBorders>
+            <w:tcMar>
+              <w:top w:type="dxa" w:w="60"/>
+              <w:left w:type="dxa" w:w="100"/>
+              <w:bottom w:type="dxa" w:w="60"/>
+              <w:right w:type="dxa" w:w="100"/>
+            </w:tcMar>
+          </w:tcPr>
+          <w:p>
+            <w:pPr>
+              <w:spacing w:after="0" w:before="0" w:line="240"/>
+            </w:pPr>
+            <w:r>
+              <w:rPr>
+                <w:rFonts w:ascii="Calibri" w:cs="Calibri" w:eastAsia="Calibri" w:hAnsi="Calibri"/>
+                <w:b w:val="false"/>
+                <w:bCs w:val="false"/>
+                <w:sz w:val="19"/>
+                <w:szCs w:val="19"/>
+              </w:rPr>
+              <w:t>Self-study</w:t>
+            </w:r>
+          </w:p>
+        </w:tc>
+        <w:tc>
+          <w:tcPr>
+            <w:tcW w:type="dxa" w:w="7480"/>
+            <w:tcBorders>
+              <w:top w:val="single" w:color="D5DCE6" w:sz="4"/>
+              <w:left w:val="single" w:color="D5DCE6" w:sz="4"/>
+              <w:bottom w:val="single" w:color="D5DCE6" w:sz="4"/>
+              <w:right w:val="single" w:color="D5DCE6" w:sz="4"/>
+            </w:tcBorders>
+            <w:tcMar>
+              <w:top w:type="dxa" w:w="60"/>
+              <w:left w:type="dxa" w:w="100"/>
+              <w:bottom w:type="dxa" w:w="60"/>
+              <w:right w:type="dxa" w:w="100"/>
+            </w:tcMar>
+          </w:tcPr>
+          <w:p>
+            <w:pPr>
+              <w:spacing w:after="0" w:before="0" w:line="240"/>
+            </w:pPr>
+            <w:r>
+              <w:rPr>
+                <w:rFonts w:ascii="Calibri" w:cs="Calibri" w:eastAsia="Calibri" w:hAnsi="Calibri"/>
+                <w:b w:val="false"/>
+                <w:bCs w:val="false"/>
+                <w:sz w:val="19"/>
+                <w:szCs w:val="19"/>
+              </w:rPr>
+              <w:t>Same order, on your own: read, do the Book in SAP with the app beside you, upload your exhibit, then answer the session's Defend It question. The Trainee User Guide walks you through it</w:t>
             </w:r>
           </w:p>
         </w:tc>
@@ -1867,7 +1936,7 @@
                 <w:sz w:val="19"/>
                 <w:szCs w:val="19"/>
               </w:rPr>
-              <w:t xml:space="preserve">Live course</w:t>
+              <w:t>Two levels</w:t>
             </w:r>
           </w:p>
         </w:tc>
@@ -1900,7 +1969,7 @@
                 <w:sz w:val="19"/>
                 <w:szCs w:val="19"/>
               </w:rPr>
-              <w:t xml:space="preserve">20 sessions, 2 hours each, Tue · Thu · Sat · Sun — about 5 weeks</w:t>
+              <w:t>Intermediate: 16 sessions over 4 weeks · Advanced: 12 sessions over 3 weeks · 2 hours each, Tue · Thu · Sat · Sun</w:t>
             </w:r>
           </w:p>
         </w:tc>
@@ -2077,7 +2146,7 @@
                 <w:sz w:val="19"/>
                 <w:szCs w:val="19"/>
               </w:rPr>
-              <w:t xml:space="preserve">After session 20</w:t>
+              <w:t>After the course</w:t>
             </w:r>
           </w:p>
         </w:tc>
@@ -2109,7 +2178,76 @@
                 <w:sz w:val="19"/>
                 <w:szCs w:val="19"/>
               </w:rPr>
-              <w:t xml:space="preserve">The 23 Beyond the Core Books, self-paced · SAP access continues for 2 more months</w:t>
+              <w:t>The 19 Beyond the Core Books, self-paced · SAP access continues for 2 more months</w:t>
+            </w:r>
+          </w:p>
+        </w:tc>
+      </w:tr>
+      <w:tr>
+        <w:trPr>
+          <w:cantSplit/>
+        </w:trPr>
+        <w:tc>
+          <w:tcPr>
+            <w:tcW w:type="dxa" w:w="3000"/>
+            <w:tcBorders>
+              <w:top w:val="single" w:color="D5DCE6" w:sz="4"/>
+              <w:left w:val="single" w:color="D5DCE6" w:sz="4"/>
+              <w:bottom w:val="single" w:color="D5DCE6" w:sz="4"/>
+              <w:right w:val="single" w:color="D5DCE6" w:sz="4"/>
+            </w:tcBorders>
+            <w:tcMar>
+              <w:top w:type="dxa" w:w="60"/>
+              <w:left w:type="dxa" w:w="100"/>
+              <w:bottom w:type="dxa" w:w="60"/>
+              <w:right w:type="dxa" w:w="100"/>
+            </w:tcMar>
+          </w:tcPr>
+          <w:p>
+            <w:pPr>
+              <w:spacing w:after="0" w:before="0" w:line="240"/>
+            </w:pPr>
+            <w:r>
+              <w:rPr>
+                <w:rFonts w:ascii="Calibri" w:cs="Calibri" w:eastAsia="Calibri" w:hAnsi="Calibri"/>
+                <w:b w:val="false"/>
+                <w:bCs w:val="false"/>
+                <w:sz w:val="19"/>
+                <w:szCs w:val="19"/>
+              </w:rPr>
+              <w:t>Self-study option</w:t>
+            </w:r>
+          </w:p>
+        </w:tc>
+        <w:tc>
+          <w:tcPr>
+            <w:tcW w:type="dxa" w:w="7080"/>
+            <w:tcBorders>
+              <w:top w:val="single" w:color="D5DCE6" w:sz="4"/>
+              <w:left w:val="single" w:color="D5DCE6" w:sz="4"/>
+              <w:bottom w:val="single" w:color="D5DCE6" w:sz="4"/>
+              <w:right w:val="single" w:color="D5DCE6" w:sz="4"/>
+            </w:tcBorders>
+            <w:tcMar>
+              <w:top w:type="dxa" w:w="60"/>
+              <w:left w:type="dxa" w:w="100"/>
+              <w:bottom w:type="dxa" w:w="60"/>
+              <w:right w:type="dxa" w:w="100"/>
+            </w:tcMar>
+          </w:tcPr>
+          <w:p>
+            <w:pPr>
+              <w:spacing w:after="0" w:before="0" w:line="240"/>
+            </w:pPr>
+            <w:r>
+              <w:rPr>
+                <w:rFonts w:ascii="Calibri" w:cs="Calibri" w:eastAsia="Calibri" w:hAnsi="Calibri"/>
+                <w:b w:val="false"/>
+                <w:bCs w:val="false"/>
+                <w:sz w:val="19"/>
+                <w:szCs w:val="19"/>
+              </w:rPr>
+              <w:t>Follow the same sessions at your own pace using the Trainee User Guide and the Reading Packs. Workpapers, the RCM, the deficiency memo and the panel are still marked by TIB instructors</w:t>
             </w:r>
           </w:p>
         </w:tc>
@@ -2129,7 +2267,7 @@
           <w:sz w:val="24"/>
           <w:szCs w:val="24"/>
         </w:rPr>
-        <w:t xml:space="preserve">The 20 sessions</w:t>
+        <w:t>Intermediate — 16 sessions</w:t>
       </w:r>
     </w:p>
     <w:tbl>
@@ -2323,7 +2461,7 @@
                 <w:sz w:val="18"/>
                 <w:szCs w:val="18"/>
               </w:rPr>
-              <w:t xml:space="preserve">1</w:t>
+              <w:t>1</w:t>
             </w:r>
           </w:p>
         </w:tc>
@@ -2355,7 +2493,7 @@
                 <w:sz w:val="18"/>
                 <w:szCs w:val="18"/>
               </w:rPr>
-              <w:t xml:space="preserve">Wk 1 · Tue</w:t>
+              <w:t>Wk 1 · Tue</w:t>
             </w:r>
           </w:p>
         </w:tc>
@@ -2387,7 +2525,7 @@
                 <w:sz w:val="18"/>
                 <w:szCs w:val="18"/>
               </w:rPr>
-              <w:t xml:space="preserve">Kickoff — controls theory recap, evidence discipline, SAP access check</w:t>
+              <w:t>Kickoff — evidence discipline</w:t>
             </w:r>
           </w:p>
         </w:tc>
@@ -2419,7 +2557,7 @@
                 <w:sz w:val="18"/>
                 <w:szCs w:val="18"/>
               </w:rPr>
-              <w:t xml:space="preserve"/>
+              <w:t>Prerequisite exam confirmed</w:t>
             </w:r>
           </w:p>
         </w:tc>
@@ -2437,27 +2575,26 @@
               <w:bottom w:val="single" w:color="D5DCE6" w:sz="4"/>
               <w:right w:val="single" w:color="D5DCE6" w:sz="4"/>
             </w:tcBorders>
-            <w:shd w:fill="F5F8FC" w:color="auto" w:val="clear"/>
-            <w:tcMar>
-              <w:top w:type="dxa" w:w="60"/>
-              <w:left w:type="dxa" w:w="100"/>
-              <w:bottom w:type="dxa" w:w="60"/>
-              <w:right w:type="dxa" w:w="100"/>
-            </w:tcMar>
-          </w:tcPr>
-          <w:p>
-            <w:pPr>
-              <w:spacing w:after="0" w:before="0" w:line="240"/>
-            </w:pPr>
-            <w:r>
-              <w:rPr>
-                <w:rFonts w:ascii="Calibri" w:cs="Calibri" w:eastAsia="Calibri" w:hAnsi="Calibri"/>
-                <w:b w:val="false"/>
-                <w:bCs w:val="false"/>
-                <w:sz w:val="18"/>
-                <w:szCs w:val="18"/>
-              </w:rPr>
-              <w:t xml:space="preserve">2</w:t>
+            <w:tcMar>
+              <w:top w:type="dxa" w:w="60"/>
+              <w:left w:type="dxa" w:w="100"/>
+              <w:bottom w:type="dxa" w:w="60"/>
+              <w:right w:type="dxa" w:w="100"/>
+            </w:tcMar>
+          </w:tcPr>
+          <w:p>
+            <w:pPr>
+              <w:spacing w:after="0" w:before="0" w:line="240"/>
+            </w:pPr>
+            <w:r>
+              <w:rPr>
+                <w:rFonts w:ascii="Calibri" w:cs="Calibri" w:eastAsia="Calibri" w:hAnsi="Calibri"/>
+                <w:b w:val="false"/>
+                <w:bCs w:val="false"/>
+                <w:sz w:val="18"/>
+                <w:szCs w:val="18"/>
+              </w:rPr>
+              <w:t>2</w:t>
             </w:r>
           </w:p>
         </w:tc>
@@ -2470,27 +2607,26 @@
               <w:bottom w:val="single" w:color="D5DCE6" w:sz="4"/>
               <w:right w:val="single" w:color="D5DCE6" w:sz="4"/>
             </w:tcBorders>
-            <w:shd w:fill="F5F8FC" w:color="auto" w:val="clear"/>
-            <w:tcMar>
-              <w:top w:type="dxa" w:w="60"/>
-              <w:left w:type="dxa" w:w="100"/>
-              <w:bottom w:type="dxa" w:w="60"/>
-              <w:right w:type="dxa" w:w="100"/>
-            </w:tcMar>
-          </w:tcPr>
-          <w:p>
-            <w:pPr>
-              <w:spacing w:after="0" w:before="0" w:line="240"/>
-            </w:pPr>
-            <w:r>
-              <w:rPr>
-                <w:rFonts w:ascii="Calibri" w:cs="Calibri" w:eastAsia="Calibri" w:hAnsi="Calibri"/>
-                <w:b w:val="false"/>
-                <w:bCs w:val="false"/>
-                <w:sz w:val="18"/>
-                <w:szCs w:val="18"/>
-              </w:rPr>
-              <w:t xml:space="preserve">Wk 1 · Thu</w:t>
+            <w:tcMar>
+              <w:top w:type="dxa" w:w="60"/>
+              <w:left w:type="dxa" w:w="100"/>
+              <w:bottom w:type="dxa" w:w="60"/>
+              <w:right w:type="dxa" w:w="100"/>
+            </w:tcMar>
+          </w:tcPr>
+          <w:p>
+            <w:pPr>
+              <w:spacing w:after="0" w:before="0" w:line="240"/>
+            </w:pPr>
+            <w:r>
+              <w:rPr>
+                <w:rFonts w:ascii="Calibri" w:cs="Calibri" w:eastAsia="Calibri" w:hAnsi="Calibri"/>
+                <w:b w:val="false"/>
+                <w:bCs w:val="false"/>
+                <w:sz w:val="18"/>
+                <w:szCs w:val="18"/>
+              </w:rPr>
+              <w:t>Wk 1 · Thu</w:t>
             </w:r>
           </w:p>
         </w:tc>
@@ -2503,27 +2639,26 @@
               <w:bottom w:val="single" w:color="D5DCE6" w:sz="4"/>
               <w:right w:val="single" w:color="D5DCE6" w:sz="4"/>
             </w:tcBorders>
-            <w:shd w:fill="F5F8FC" w:color="auto" w:val="clear"/>
-            <w:tcMar>
-              <w:top w:type="dxa" w:w="60"/>
-              <w:left w:type="dxa" w:w="100"/>
-              <w:bottom w:type="dxa" w:w="60"/>
-              <w:right w:type="dxa" w:w="100"/>
-            </w:tcMar>
-          </w:tcPr>
-          <w:p>
-            <w:pPr>
-              <w:spacing w:after="0" w:before="0" w:line="240"/>
-            </w:pPr>
-            <w:r>
-              <w:rPr>
-                <w:rFonts w:ascii="Calibri" w:cs="Calibri" w:eastAsia="Calibri" w:hAnsi="Calibri"/>
-                <w:b w:val="false"/>
-                <w:bCs w:val="false"/>
-                <w:sz w:val="18"/>
-                <w:szCs w:val="18"/>
-              </w:rPr>
-              <w:t xml:space="preserve">Book 1 — The Access List</w:t>
+            <w:tcMar>
+              <w:top w:type="dxa" w:w="60"/>
+              <w:left w:type="dxa" w:w="100"/>
+              <w:bottom w:type="dxa" w:w="60"/>
+              <w:right w:type="dxa" w:w="100"/>
+            </w:tcMar>
+          </w:tcPr>
+          <w:p>
+            <w:pPr>
+              <w:spacing w:after="0" w:before="0" w:line="240"/>
+            </w:pPr>
+            <w:r>
+              <w:rPr>
+                <w:rFonts w:ascii="Calibri" w:cs="Calibri" w:eastAsia="Calibri" w:hAnsi="Calibri"/>
+                <w:b w:val="false"/>
+                <w:bCs w:val="false"/>
+                <w:sz w:val="18"/>
+                <w:szCs w:val="18"/>
+              </w:rPr>
+              <w:t>Book 1 — The Access List</w:t>
             </w:r>
           </w:p>
         </w:tc>
@@ -2536,27 +2671,25 @@
               <w:bottom w:val="single" w:color="D5DCE6" w:sz="4"/>
               <w:right w:val="single" w:color="D5DCE6" w:sz="4"/>
             </w:tcBorders>
-            <w:shd w:fill="F5F8FC" w:color="auto" w:val="clear"/>
-            <w:tcMar>
-              <w:top w:type="dxa" w:w="60"/>
-              <w:left w:type="dxa" w:w="100"/>
-              <w:bottom w:type="dxa" w:w="60"/>
-              <w:right w:type="dxa" w:w="100"/>
-            </w:tcMar>
-          </w:tcPr>
-          <w:p>
-            <w:pPr>
-              <w:spacing w:after="0" w:before="0" w:line="240"/>
-            </w:pPr>
-            <w:r>
-              <w:rPr>
-                <w:rFonts w:ascii="Calibri" w:cs="Calibri" w:eastAsia="Calibri" w:hAnsi="Calibri"/>
-                <w:b w:val="false"/>
-                <w:bCs w:val="false"/>
-                <w:sz w:val="18"/>
-                <w:szCs w:val="18"/>
-              </w:rPr>
-              <w:t xml:space="preserve"/>
+            <w:tcMar>
+              <w:top w:type="dxa" w:w="60"/>
+              <w:left w:type="dxa" w:w="100"/>
+              <w:bottom w:type="dxa" w:w="60"/>
+              <w:right w:type="dxa" w:w="100"/>
+            </w:tcMar>
+          </w:tcPr>
+          <w:p>
+            <w:pPr>
+              <w:spacing w:after="0" w:before="0" w:line="240"/>
+            </w:pPr>
+            <w:r>
+              <w:rPr>
+                <w:rFonts w:ascii="Calibri" w:cs="Calibri" w:eastAsia="Calibri" w:hAnsi="Calibri"/>
+                <w:b w:val="false"/>
+                <w:bCs w:val="false"/>
+                <w:sz w:val="18"/>
+                <w:szCs w:val="18"/>
+              </w:rPr>
             </w:r>
           </w:p>
         </w:tc>
@@ -2593,7 +2726,7 @@
                 <w:sz w:val="18"/>
                 <w:szCs w:val="18"/>
               </w:rPr>
-              <w:t xml:space="preserve">3</w:t>
+              <w:t>3</w:t>
             </w:r>
           </w:p>
         </w:tc>
@@ -2625,7 +2758,7 @@
                 <w:sz w:val="18"/>
                 <w:szCs w:val="18"/>
               </w:rPr>
-              <w:t xml:space="preserve">Wk 1 · Sat</w:t>
+              <w:t>Wk 1 · Sat</w:t>
             </w:r>
           </w:p>
         </w:tc>
@@ -2657,7 +2790,7 @@
                 <w:sz w:val="18"/>
                 <w:szCs w:val="18"/>
               </w:rPr>
-              <w:t xml:space="preserve">Book 4 — The Next Badge + Book 17 — The Leaver</w:t>
+              <w:t>Book 17 — The Leaver · then guided self-study: Book 4 — The Next Badge</w:t>
             </w:r>
           </w:p>
         </w:tc>
@@ -2689,7 +2822,6 @@
                 <w:sz w:val="18"/>
                 <w:szCs w:val="18"/>
               </w:rPr>
-              <w:t xml:space="preserve"/>
             </w:r>
           </w:p>
         </w:tc>
@@ -2707,27 +2839,26 @@
               <w:bottom w:val="single" w:color="D5DCE6" w:sz="4"/>
               <w:right w:val="single" w:color="D5DCE6" w:sz="4"/>
             </w:tcBorders>
-            <w:shd w:fill="F5F8FC" w:color="auto" w:val="clear"/>
-            <w:tcMar>
-              <w:top w:type="dxa" w:w="60"/>
-              <w:left w:type="dxa" w:w="100"/>
-              <w:bottom w:type="dxa" w:w="60"/>
-              <w:right w:type="dxa" w:w="100"/>
-            </w:tcMar>
-          </w:tcPr>
-          <w:p>
-            <w:pPr>
-              <w:spacing w:after="0" w:before="0" w:line="240"/>
-            </w:pPr>
-            <w:r>
-              <w:rPr>
-                <w:rFonts w:ascii="Calibri" w:cs="Calibri" w:eastAsia="Calibri" w:hAnsi="Calibri"/>
-                <w:b w:val="false"/>
-                <w:bCs w:val="false"/>
-                <w:sz w:val="18"/>
-                <w:szCs w:val="18"/>
-              </w:rPr>
-              <w:t xml:space="preserve">4</w:t>
+            <w:tcMar>
+              <w:top w:type="dxa" w:w="60"/>
+              <w:left w:type="dxa" w:w="100"/>
+              <w:bottom w:type="dxa" w:w="60"/>
+              <w:right w:type="dxa" w:w="100"/>
+            </w:tcMar>
+          </w:tcPr>
+          <w:p>
+            <w:pPr>
+              <w:spacing w:after="0" w:before="0" w:line="240"/>
+            </w:pPr>
+            <w:r>
+              <w:rPr>
+                <w:rFonts w:ascii="Calibri" w:cs="Calibri" w:eastAsia="Calibri" w:hAnsi="Calibri"/>
+                <w:b w:val="false"/>
+                <w:bCs w:val="false"/>
+                <w:sz w:val="18"/>
+                <w:szCs w:val="18"/>
+              </w:rPr>
+              <w:t>4</w:t>
             </w:r>
           </w:p>
         </w:tc>
@@ -2740,27 +2871,26 @@
               <w:bottom w:val="single" w:color="D5DCE6" w:sz="4"/>
               <w:right w:val="single" w:color="D5DCE6" w:sz="4"/>
             </w:tcBorders>
-            <w:shd w:fill="F5F8FC" w:color="auto" w:val="clear"/>
-            <w:tcMar>
-              <w:top w:type="dxa" w:w="60"/>
-              <w:left w:type="dxa" w:w="100"/>
-              <w:bottom w:type="dxa" w:w="60"/>
-              <w:right w:type="dxa" w:w="100"/>
-            </w:tcMar>
-          </w:tcPr>
-          <w:p>
-            <w:pPr>
-              <w:spacing w:after="0" w:before="0" w:line="240"/>
-            </w:pPr>
-            <w:r>
-              <w:rPr>
-                <w:rFonts w:ascii="Calibri" w:cs="Calibri" w:eastAsia="Calibri" w:hAnsi="Calibri"/>
-                <w:b w:val="false"/>
-                <w:bCs w:val="false"/>
-                <w:sz w:val="18"/>
-                <w:szCs w:val="18"/>
-              </w:rPr>
-              <w:t xml:space="preserve">Wk 1 · Sun</w:t>
+            <w:tcMar>
+              <w:top w:type="dxa" w:w="60"/>
+              <w:left w:type="dxa" w:w="100"/>
+              <w:bottom w:type="dxa" w:w="60"/>
+              <w:right w:type="dxa" w:w="100"/>
+            </w:tcMar>
+          </w:tcPr>
+          <w:p>
+            <w:pPr>
+              <w:spacing w:after="0" w:before="0" w:line="240"/>
+            </w:pPr>
+            <w:r>
+              <w:rPr>
+                <w:rFonts w:ascii="Calibri" w:cs="Calibri" w:eastAsia="Calibri" w:hAnsi="Calibri"/>
+                <w:b w:val="false"/>
+                <w:bCs w:val="false"/>
+                <w:sz w:val="18"/>
+                <w:szCs w:val="18"/>
+              </w:rPr>
+              <w:t>Wk 1 · Sun</w:t>
             </w:r>
           </w:p>
         </w:tc>
@@ -2773,27 +2903,26 @@
               <w:bottom w:val="single" w:color="D5DCE6" w:sz="4"/>
               <w:right w:val="single" w:color="D5DCE6" w:sz="4"/>
             </w:tcBorders>
-            <w:shd w:fill="F5F8FC" w:color="auto" w:val="clear"/>
-            <w:tcMar>
-              <w:top w:type="dxa" w:w="60"/>
-              <w:left w:type="dxa" w:w="100"/>
-              <w:bottom w:type="dxa" w:w="60"/>
-              <w:right w:type="dxa" w:w="100"/>
-            </w:tcMar>
-          </w:tcPr>
-          <w:p>
-            <w:pPr>
-              <w:spacing w:after="0" w:before="0" w:line="240"/>
-            </w:pPr>
-            <w:r>
-              <w:rPr>
-                <w:rFonts w:ascii="Calibri" w:cs="Calibri" w:eastAsia="Calibri" w:hAnsi="Calibri"/>
-                <w:b w:val="false"/>
-                <w:bCs w:val="false"/>
-                <w:sz w:val="18"/>
-                <w:szCs w:val="18"/>
-              </w:rPr>
-              <w:t xml:space="preserve">Book 7 — The Fourth Chair + Book 13 — The Tile</w:t>
+            <w:tcMar>
+              <w:top w:type="dxa" w:w="60"/>
+              <w:left w:type="dxa" w:w="100"/>
+              <w:bottom w:type="dxa" w:w="60"/>
+              <w:right w:type="dxa" w:w="100"/>
+            </w:tcMar>
+          </w:tcPr>
+          <w:p>
+            <w:pPr>
+              <w:spacing w:after="0" w:before="0" w:line="240"/>
+            </w:pPr>
+            <w:r>
+              <w:rPr>
+                <w:rFonts w:ascii="Calibri" w:cs="Calibri" w:eastAsia="Calibri" w:hAnsi="Calibri"/>
+                <w:b w:val="false"/>
+                <w:bCs w:val="false"/>
+                <w:sz w:val="18"/>
+                <w:szCs w:val="18"/>
+              </w:rPr>
+              <w:t>Book 7 — The Fourth Chair</w:t>
             </w:r>
           </w:p>
         </w:tc>
@@ -2806,27 +2935,25 @@
               <w:bottom w:val="single" w:color="D5DCE6" w:sz="4"/>
               <w:right w:val="single" w:color="D5DCE6" w:sz="4"/>
             </w:tcBorders>
-            <w:shd w:fill="F5F8FC" w:color="auto" w:val="clear"/>
-            <w:tcMar>
-              <w:top w:type="dxa" w:w="60"/>
-              <w:left w:type="dxa" w:w="100"/>
-              <w:bottom w:type="dxa" w:w="60"/>
-              <w:right w:type="dxa" w:w="100"/>
-            </w:tcMar>
-          </w:tcPr>
-          <w:p>
-            <w:pPr>
-              <w:spacing w:after="0" w:before="0" w:line="240"/>
-            </w:pPr>
-            <w:r>
-              <w:rPr>
-                <w:rFonts w:ascii="Calibri" w:cs="Calibri" w:eastAsia="Calibri" w:hAnsi="Calibri"/>
-                <w:b w:val="false"/>
-                <w:bCs w:val="false"/>
-                <w:sz w:val="18"/>
-                <w:szCs w:val="18"/>
-              </w:rPr>
-              <w:t xml:space="preserve"/>
+            <w:tcMar>
+              <w:top w:type="dxa" w:w="60"/>
+              <w:left w:type="dxa" w:w="100"/>
+              <w:bottom w:type="dxa" w:w="60"/>
+              <w:right w:type="dxa" w:w="100"/>
+            </w:tcMar>
+          </w:tcPr>
+          <w:p>
+            <w:pPr>
+              <w:spacing w:after="0" w:before="0" w:line="240"/>
+            </w:pPr>
+            <w:r>
+              <w:rPr>
+                <w:rFonts w:ascii="Calibri" w:cs="Calibri" w:eastAsia="Calibri" w:hAnsi="Calibri"/>
+                <w:b w:val="false"/>
+                <w:bCs w:val="false"/>
+                <w:sz w:val="18"/>
+                <w:szCs w:val="18"/>
+              </w:rPr>
             </w:r>
           </w:p>
         </w:tc>
@@ -2863,7 +2990,7 @@
                 <w:sz w:val="18"/>
                 <w:szCs w:val="18"/>
               </w:rPr>
-              <w:t xml:space="preserve">5</w:t>
+              <w:t>5</w:t>
             </w:r>
           </w:p>
         </w:tc>
@@ -2895,7 +3022,7 @@
                 <w:sz w:val="18"/>
                 <w:szCs w:val="18"/>
               </w:rPr>
-              <w:t xml:space="preserve">Wk 2 · Tue</w:t>
+              <w:t>Wk 2 · Tue</w:t>
             </w:r>
           </w:p>
         </w:tc>
@@ -2927,7 +3054,7 @@
                 <w:sz w:val="18"/>
                 <w:szCs w:val="18"/>
               </w:rPr>
-              <w:t xml:space="preserve">Book 16 — The Firefighter Log</w:t>
+              <w:t>Book 13 — The Tile</w:t>
             </w:r>
           </w:p>
         </w:tc>
@@ -2959,7 +3086,6 @@
                 <w:sz w:val="18"/>
                 <w:szCs w:val="18"/>
               </w:rPr>
-              <w:t xml:space="preserve">Workpaper 1 (access) assigned — due before session 8</w:t>
             </w:r>
           </w:p>
         </w:tc>
@@ -2977,27 +3103,26 @@
               <w:bottom w:val="single" w:color="D5DCE6" w:sz="4"/>
               <w:right w:val="single" w:color="D5DCE6" w:sz="4"/>
             </w:tcBorders>
-            <w:shd w:fill="F5F8FC" w:color="auto" w:val="clear"/>
-            <w:tcMar>
-              <w:top w:type="dxa" w:w="60"/>
-              <w:left w:type="dxa" w:w="100"/>
-              <w:bottom w:type="dxa" w:w="60"/>
-              <w:right w:type="dxa" w:w="100"/>
-            </w:tcMar>
-          </w:tcPr>
-          <w:p>
-            <w:pPr>
-              <w:spacing w:after="0" w:before="0" w:line="240"/>
-            </w:pPr>
-            <w:r>
-              <w:rPr>
-                <w:rFonts w:ascii="Calibri" w:cs="Calibri" w:eastAsia="Calibri" w:hAnsi="Calibri"/>
-                <w:b w:val="false"/>
-                <w:bCs w:val="false"/>
-                <w:sz w:val="18"/>
-                <w:szCs w:val="18"/>
-              </w:rPr>
-              <w:t xml:space="preserve">6</w:t>
+            <w:tcMar>
+              <w:top w:type="dxa" w:w="60"/>
+              <w:left w:type="dxa" w:w="100"/>
+              <w:bottom w:type="dxa" w:w="60"/>
+              <w:right w:type="dxa" w:w="100"/>
+            </w:tcMar>
+          </w:tcPr>
+          <w:p>
+            <w:pPr>
+              <w:spacing w:after="0" w:before="0" w:line="240"/>
+            </w:pPr>
+            <w:r>
+              <w:rPr>
+                <w:rFonts w:ascii="Calibri" w:cs="Calibri" w:eastAsia="Calibri" w:hAnsi="Calibri"/>
+                <w:b w:val="false"/>
+                <w:bCs w:val="false"/>
+                <w:sz w:val="18"/>
+                <w:szCs w:val="18"/>
+              </w:rPr>
+              <w:t>6</w:t>
             </w:r>
           </w:p>
         </w:tc>
@@ -3010,27 +3135,26 @@
               <w:bottom w:val="single" w:color="D5DCE6" w:sz="4"/>
               <w:right w:val="single" w:color="D5DCE6" w:sz="4"/>
             </w:tcBorders>
-            <w:shd w:fill="F5F8FC" w:color="auto" w:val="clear"/>
-            <w:tcMar>
-              <w:top w:type="dxa" w:w="60"/>
-              <w:left w:type="dxa" w:w="100"/>
-              <w:bottom w:type="dxa" w:w="60"/>
-              <w:right w:type="dxa" w:w="100"/>
-            </w:tcMar>
-          </w:tcPr>
-          <w:p>
-            <w:pPr>
-              <w:spacing w:after="0" w:before="0" w:line="240"/>
-            </w:pPr>
-            <w:r>
-              <w:rPr>
-                <w:rFonts w:ascii="Calibri" w:cs="Calibri" w:eastAsia="Calibri" w:hAnsi="Calibri"/>
-                <w:b w:val="false"/>
-                <w:bCs w:val="false"/>
-                <w:sz w:val="18"/>
-                <w:szCs w:val="18"/>
-              </w:rPr>
-              <w:t xml:space="preserve">Wk 2 · Thu</w:t>
+            <w:tcMar>
+              <w:top w:type="dxa" w:w="60"/>
+              <w:left w:type="dxa" w:w="100"/>
+              <w:bottom w:type="dxa" w:w="60"/>
+              <w:right w:type="dxa" w:w="100"/>
+            </w:tcMar>
+          </w:tcPr>
+          <w:p>
+            <w:pPr>
+              <w:spacing w:after="0" w:before="0" w:line="240"/>
+            </w:pPr>
+            <w:r>
+              <w:rPr>
+                <w:rFonts w:ascii="Calibri" w:cs="Calibri" w:eastAsia="Calibri" w:hAnsi="Calibri"/>
+                <w:b w:val="false"/>
+                <w:bCs w:val="false"/>
+                <w:sz w:val="18"/>
+                <w:szCs w:val="18"/>
+              </w:rPr>
+              <w:t>Wk 2 · Thu</w:t>
             </w:r>
           </w:p>
         </w:tc>
@@ -3043,27 +3167,26 @@
               <w:bottom w:val="single" w:color="D5DCE6" w:sz="4"/>
               <w:right w:val="single" w:color="D5DCE6" w:sz="4"/>
             </w:tcBorders>
-            <w:shd w:fill="F5F8FC" w:color="auto" w:val="clear"/>
-            <w:tcMar>
-              <w:top w:type="dxa" w:w="60"/>
-              <w:left w:type="dxa" w:w="100"/>
-              <w:bottom w:type="dxa" w:w="60"/>
-              <w:right w:type="dxa" w:w="100"/>
-            </w:tcMar>
-          </w:tcPr>
-          <w:p>
-            <w:pPr>
-              <w:spacing w:after="0" w:before="0" w:line="240"/>
-            </w:pPr>
-            <w:r>
-              <w:rPr>
-                <w:rFonts w:ascii="Calibri" w:cs="Calibri" w:eastAsia="Calibri" w:hAnsi="Calibri"/>
-                <w:b w:val="false"/>
-                <w:bCs w:val="false"/>
-                <w:sz w:val="18"/>
-                <w:szCs w:val="18"/>
-              </w:rPr>
-              <w:t xml:space="preserve">Book 2 — The Emergency Change</w:t>
+            <w:tcMar>
+              <w:top w:type="dxa" w:w="60"/>
+              <w:left w:type="dxa" w:w="100"/>
+              <w:bottom w:type="dxa" w:w="60"/>
+              <w:right w:type="dxa" w:w="100"/>
+            </w:tcMar>
+          </w:tcPr>
+          <w:p>
+            <w:pPr>
+              <w:spacing w:after="0" w:before="0" w:line="240"/>
+            </w:pPr>
+            <w:r>
+              <w:rPr>
+                <w:rFonts w:ascii="Calibri" w:cs="Calibri" w:eastAsia="Calibri" w:hAnsi="Calibri"/>
+                <w:b w:val="false"/>
+                <w:bCs w:val="false"/>
+                <w:sz w:val="18"/>
+                <w:szCs w:val="18"/>
+              </w:rPr>
+              <w:t>Book 16 — The Firefighter Log</w:t>
             </w:r>
           </w:p>
         </w:tc>
@@ -3076,27 +3199,26 @@
               <w:bottom w:val="single" w:color="D5DCE6" w:sz="4"/>
               <w:right w:val="single" w:color="D5DCE6" w:sz="4"/>
             </w:tcBorders>
-            <w:shd w:fill="F5F8FC" w:color="auto" w:val="clear"/>
-            <w:tcMar>
-              <w:top w:type="dxa" w:w="60"/>
-              <w:left w:type="dxa" w:w="100"/>
-              <w:bottom w:type="dxa" w:w="60"/>
-              <w:right w:type="dxa" w:w="100"/>
-            </w:tcMar>
-          </w:tcPr>
-          <w:p>
-            <w:pPr>
-              <w:spacing w:after="0" w:before="0" w:line="240"/>
-            </w:pPr>
-            <w:r>
-              <w:rPr>
-                <w:rFonts w:ascii="Calibri" w:cs="Calibri" w:eastAsia="Calibri" w:hAnsi="Calibri"/>
-                <w:b w:val="false"/>
-                <w:bCs w:val="false"/>
-                <w:sz w:val="18"/>
-                <w:szCs w:val="18"/>
-              </w:rPr>
-              <w:t xml:space="preserve"/>
+            <w:tcMar>
+              <w:top w:type="dxa" w:w="60"/>
+              <w:left w:type="dxa" w:w="100"/>
+              <w:bottom w:type="dxa" w:w="60"/>
+              <w:right w:type="dxa" w:w="100"/>
+            </w:tcMar>
+          </w:tcPr>
+          <w:p>
+            <w:pPr>
+              <w:spacing w:after="0" w:before="0" w:line="240"/>
+            </w:pPr>
+            <w:r>
+              <w:rPr>
+                <w:rFonts w:ascii="Calibri" w:cs="Calibri" w:eastAsia="Calibri" w:hAnsi="Calibri"/>
+                <w:b w:val="false"/>
+                <w:bCs w:val="false"/>
+                <w:sz w:val="18"/>
+                <w:szCs w:val="18"/>
+              </w:rPr>
+              <w:t>Workpaper 1 (Access / SoD) assigned — due before session 9</w:t>
             </w:r>
           </w:p>
         </w:tc>
@@ -3133,7 +3255,7 @@
                 <w:sz w:val="18"/>
                 <w:szCs w:val="18"/>
               </w:rPr>
-              <w:t xml:space="preserve">7</w:t>
+              <w:t>7</w:t>
             </w:r>
           </w:p>
         </w:tc>
@@ -3165,7 +3287,7 @@
                 <w:sz w:val="18"/>
                 <w:szCs w:val="18"/>
               </w:rPr>
-              <w:t xml:space="preserve">Wk 2 · Sat</w:t>
+              <w:t>Wk 2 · Sat</w:t>
             </w:r>
           </w:p>
         </w:tc>
@@ -3197,7 +3319,7 @@
                 <w:sz w:val="18"/>
                 <w:szCs w:val="18"/>
               </w:rPr>
-              <w:t xml:space="preserve">Book 20 — The Back Door</w:t>
+              <w:t>Book 2 — The Emergency Change</w:t>
             </w:r>
           </w:p>
         </w:tc>
@@ -3229,7 +3351,6 @@
                 <w:sz w:val="18"/>
                 <w:szCs w:val="18"/>
               </w:rPr>
-              <w:t xml:space="preserve"/>
             </w:r>
           </w:p>
         </w:tc>
@@ -3247,27 +3368,26 @@
               <w:bottom w:val="single" w:color="D5DCE6" w:sz="4"/>
               <w:right w:val="single" w:color="D5DCE6" w:sz="4"/>
             </w:tcBorders>
-            <w:shd w:fill="F5F8FC" w:color="auto" w:val="clear"/>
-            <w:tcMar>
-              <w:top w:type="dxa" w:w="60"/>
-              <w:left w:type="dxa" w:w="100"/>
-              <w:bottom w:type="dxa" w:w="60"/>
-              <w:right w:type="dxa" w:w="100"/>
-            </w:tcMar>
-          </w:tcPr>
-          <w:p>
-            <w:pPr>
-              <w:spacing w:after="0" w:before="0" w:line="240"/>
-            </w:pPr>
-            <w:r>
-              <w:rPr>
-                <w:rFonts w:ascii="Calibri" w:cs="Calibri" w:eastAsia="Calibri" w:hAnsi="Calibri"/>
-                <w:b w:val="false"/>
-                <w:bCs w:val="false"/>
-                <w:sz w:val="18"/>
-                <w:szCs w:val="18"/>
-              </w:rPr>
-              <w:t xml:space="preserve">8</w:t>
+            <w:tcMar>
+              <w:top w:type="dxa" w:w="60"/>
+              <w:left w:type="dxa" w:w="100"/>
+              <w:bottom w:type="dxa" w:w="60"/>
+              <w:right w:type="dxa" w:w="100"/>
+            </w:tcMar>
+          </w:tcPr>
+          <w:p>
+            <w:pPr>
+              <w:spacing w:after="0" w:before="0" w:line="240"/>
+            </w:pPr>
+            <w:r>
+              <w:rPr>
+                <w:rFonts w:ascii="Calibri" w:cs="Calibri" w:eastAsia="Calibri" w:hAnsi="Calibri"/>
+                <w:b w:val="false"/>
+                <w:bCs w:val="false"/>
+                <w:sz w:val="18"/>
+                <w:szCs w:val="18"/>
+              </w:rPr>
+              <w:t>8</w:t>
             </w:r>
           </w:p>
         </w:tc>
@@ -3280,27 +3400,26 @@
               <w:bottom w:val="single" w:color="D5DCE6" w:sz="4"/>
               <w:right w:val="single" w:color="D5DCE6" w:sz="4"/>
             </w:tcBorders>
-            <w:shd w:fill="F5F8FC" w:color="auto" w:val="clear"/>
-            <w:tcMar>
-              <w:top w:type="dxa" w:w="60"/>
-              <w:left w:type="dxa" w:w="100"/>
-              <w:bottom w:type="dxa" w:w="60"/>
-              <w:right w:type="dxa" w:w="100"/>
-            </w:tcMar>
-          </w:tcPr>
-          <w:p>
-            <w:pPr>
-              <w:spacing w:after="0" w:before="0" w:line="240"/>
-            </w:pPr>
-            <w:r>
-              <w:rPr>
-                <w:rFonts w:ascii="Calibri" w:cs="Calibri" w:eastAsia="Calibri" w:hAnsi="Calibri"/>
-                <w:b w:val="false"/>
-                <w:bCs w:val="false"/>
-                <w:sz w:val="18"/>
-                <w:szCs w:val="18"/>
-              </w:rPr>
-              <w:t xml:space="preserve">Wk 2 · Sun</w:t>
+            <w:tcMar>
+              <w:top w:type="dxa" w:w="60"/>
+              <w:left w:type="dxa" w:w="100"/>
+              <w:bottom w:type="dxa" w:w="60"/>
+              <w:right w:type="dxa" w:w="100"/>
+            </w:tcMar>
+          </w:tcPr>
+          <w:p>
+            <w:pPr>
+              <w:spacing w:after="0" w:before="0" w:line="240"/>
+            </w:pPr>
+            <w:r>
+              <w:rPr>
+                <w:rFonts w:ascii="Calibri" w:cs="Calibri" w:eastAsia="Calibri" w:hAnsi="Calibri"/>
+                <w:b w:val="false"/>
+                <w:bCs w:val="false"/>
+                <w:sz w:val="18"/>
+                <w:szCs w:val="18"/>
+              </w:rPr>
+              <w:t>Wk 2 · Sun</w:t>
             </w:r>
           </w:p>
         </w:tc>
@@ -3313,27 +3432,26 @@
               <w:bottom w:val="single" w:color="D5DCE6" w:sz="4"/>
               <w:right w:val="single" w:color="D5DCE6" w:sz="4"/>
             </w:tcBorders>
-            <w:shd w:fill="F5F8FC" w:color="auto" w:val="clear"/>
-            <w:tcMar>
-              <w:top w:type="dxa" w:w="60"/>
-              <w:left w:type="dxa" w:w="100"/>
-              <w:bottom w:type="dxa" w:w="60"/>
-              <w:right w:type="dxa" w:w="100"/>
-            </w:tcMar>
-          </w:tcPr>
-          <w:p>
-            <w:pPr>
-              <w:spacing w:after="0" w:before="0" w:line="240"/>
-            </w:pPr>
-            <w:r>
-              <w:rPr>
-                <w:rFonts w:ascii="Calibri" w:cs="Calibri" w:eastAsia="Calibri" w:hAnsi="Calibri"/>
-                <w:b w:val="false"/>
-                <w:bCs w:val="false"/>
-                <w:sz w:val="18"/>
-                <w:szCs w:val="18"/>
-              </w:rPr>
-              <w:t xml:space="preserve">Book 18 — The Untested Backup + Book 19 — The Interface Gap</w:t>
+            <w:tcMar>
+              <w:top w:type="dxa" w:w="60"/>
+              <w:left w:type="dxa" w:w="100"/>
+              <w:bottom w:type="dxa" w:w="60"/>
+              <w:right w:type="dxa" w:w="100"/>
+            </w:tcMar>
+          </w:tcPr>
+          <w:p>
+            <w:pPr>
+              <w:spacing w:after="0" w:before="0" w:line="240"/>
+            </w:pPr>
+            <w:r>
+              <w:rPr>
+                <w:rFonts w:ascii="Calibri" w:cs="Calibri" w:eastAsia="Calibri" w:hAnsi="Calibri"/>
+                <w:b w:val="false"/>
+                <w:bCs w:val="false"/>
+                <w:sz w:val="18"/>
+                <w:szCs w:val="18"/>
+              </w:rPr>
+              <w:t>Book 20 — The Back Door · then guided self-study: Book 18 — The Untested Backup</w:t>
             </w:r>
           </w:p>
         </w:tc>
@@ -3346,27 +3464,25 @@
               <w:bottom w:val="single" w:color="D5DCE6" w:sz="4"/>
               <w:right w:val="single" w:color="D5DCE6" w:sz="4"/>
             </w:tcBorders>
-            <w:shd w:fill="F5F8FC" w:color="auto" w:val="clear"/>
-            <w:tcMar>
-              <w:top w:type="dxa" w:w="60"/>
-              <w:left w:type="dxa" w:w="100"/>
-              <w:bottom w:type="dxa" w:w="60"/>
-              <w:right w:type="dxa" w:w="100"/>
-            </w:tcMar>
-          </w:tcPr>
-          <w:p>
-            <w:pPr>
-              <w:spacing w:after="0" w:before="0" w:line="240"/>
-            </w:pPr>
-            <w:r>
-              <w:rPr>
-                <w:rFonts w:ascii="Calibri" w:cs="Calibri" w:eastAsia="Calibri" w:hAnsi="Calibri"/>
-                <w:b w:val="false"/>
-                <w:bCs w:val="false"/>
-                <w:sz w:val="18"/>
-                <w:szCs w:val="18"/>
-              </w:rPr>
-              <w:t xml:space="preserve">Workpaper 2 (change) assigned — due before session 13 · Workpaper 1 returned marked</w:t>
+            <w:tcMar>
+              <w:top w:type="dxa" w:w="60"/>
+              <w:left w:type="dxa" w:w="100"/>
+              <w:bottom w:type="dxa" w:w="60"/>
+              <w:right w:type="dxa" w:w="100"/>
+            </w:tcMar>
+          </w:tcPr>
+          <w:p>
+            <w:pPr>
+              <w:spacing w:after="0" w:before="0" w:line="240"/>
+            </w:pPr>
+            <w:r>
+              <w:rPr>
+                <w:rFonts w:ascii="Calibri" w:cs="Calibri" w:eastAsia="Calibri" w:hAnsi="Calibri"/>
+                <w:b w:val="false"/>
+                <w:bCs w:val="false"/>
+                <w:sz w:val="18"/>
+                <w:szCs w:val="18"/>
+              </w:rPr>
             </w:r>
           </w:p>
         </w:tc>
@@ -3403,7 +3519,7 @@
                 <w:sz w:val="18"/>
                 <w:szCs w:val="18"/>
               </w:rPr>
-              <w:t xml:space="preserve">9</w:t>
+              <w:t>9</w:t>
             </w:r>
           </w:p>
         </w:tc>
@@ -3435,7 +3551,7 @@
                 <w:sz w:val="18"/>
                 <w:szCs w:val="18"/>
               </w:rPr>
-              <w:t xml:space="preserve">Wk 3 · Tue</w:t>
+              <w:t>Wk 3 · Tue</w:t>
             </w:r>
           </w:p>
         </w:tc>
@@ -3467,7 +3583,7 @@
                 <w:sz w:val="18"/>
                 <w:szCs w:val="18"/>
               </w:rPr>
-              <w:t xml:space="preserve">Book 14 — The Rule That Never Fired + Book 23 — The Job That Stopped Running</w:t>
+              <w:t>Book 19 — The Interface Gap</w:t>
             </w:r>
           </w:p>
         </w:tc>
@@ -3499,7 +3615,7 @@
                 <w:sz w:val="18"/>
                 <w:szCs w:val="18"/>
               </w:rPr>
-              <w:t xml:space="preserve"/>
+              <w:t>Workpaper 2 (Change &amp; Operations) assigned — due before session 13 · Workpaper 1 returned marked</w:t>
             </w:r>
           </w:p>
         </w:tc>
@@ -3517,27 +3633,26 @@
               <w:bottom w:val="single" w:color="D5DCE6" w:sz="4"/>
               <w:right w:val="single" w:color="D5DCE6" w:sz="4"/>
             </w:tcBorders>
-            <w:shd w:fill="F5F8FC" w:color="auto" w:val="clear"/>
-            <w:tcMar>
-              <w:top w:type="dxa" w:w="60"/>
-              <w:left w:type="dxa" w:w="100"/>
-              <w:bottom w:type="dxa" w:w="60"/>
-              <w:right w:type="dxa" w:w="100"/>
-            </w:tcMar>
-          </w:tcPr>
-          <w:p>
-            <w:pPr>
-              <w:spacing w:after="0" w:before="0" w:line="240"/>
-            </w:pPr>
-            <w:r>
-              <w:rPr>
-                <w:rFonts w:ascii="Calibri" w:cs="Calibri" w:eastAsia="Calibri" w:hAnsi="Calibri"/>
-                <w:b w:val="false"/>
-                <w:bCs w:val="false"/>
-                <w:sz w:val="18"/>
-                <w:szCs w:val="18"/>
-              </w:rPr>
-              <w:t xml:space="preserve">10</w:t>
+            <w:tcMar>
+              <w:top w:type="dxa" w:w="60"/>
+              <w:left w:type="dxa" w:w="100"/>
+              <w:bottom w:type="dxa" w:w="60"/>
+              <w:right w:type="dxa" w:w="100"/>
+            </w:tcMar>
+          </w:tcPr>
+          <w:p>
+            <w:pPr>
+              <w:spacing w:after="0" w:before="0" w:line="240"/>
+            </w:pPr>
+            <w:r>
+              <w:rPr>
+                <w:rFonts w:ascii="Calibri" w:cs="Calibri" w:eastAsia="Calibri" w:hAnsi="Calibri"/>
+                <w:b w:val="false"/>
+                <w:bCs w:val="false"/>
+                <w:sz w:val="18"/>
+                <w:szCs w:val="18"/>
+              </w:rPr>
+              <w:t>10</w:t>
             </w:r>
           </w:p>
         </w:tc>
@@ -3550,27 +3665,26 @@
               <w:bottom w:val="single" w:color="D5DCE6" w:sz="4"/>
               <w:right w:val="single" w:color="D5DCE6" w:sz="4"/>
             </w:tcBorders>
-            <w:shd w:fill="F5F8FC" w:color="auto" w:val="clear"/>
-            <w:tcMar>
-              <w:top w:type="dxa" w:w="60"/>
-              <w:left w:type="dxa" w:w="100"/>
-              <w:bottom w:type="dxa" w:w="60"/>
-              <w:right w:type="dxa" w:w="100"/>
-            </w:tcMar>
-          </w:tcPr>
-          <w:p>
-            <w:pPr>
-              <w:spacing w:after="0" w:before="0" w:line="240"/>
-            </w:pPr>
-            <w:r>
-              <w:rPr>
-                <w:rFonts w:ascii="Calibri" w:cs="Calibri" w:eastAsia="Calibri" w:hAnsi="Calibri"/>
-                <w:b w:val="false"/>
-                <w:bCs w:val="false"/>
-                <w:sz w:val="18"/>
-                <w:szCs w:val="18"/>
-              </w:rPr>
-              <w:t xml:space="preserve">Wk 3 · Thu</w:t>
+            <w:tcMar>
+              <w:top w:type="dxa" w:w="60"/>
+              <w:left w:type="dxa" w:w="100"/>
+              <w:bottom w:type="dxa" w:w="60"/>
+              <w:right w:type="dxa" w:w="100"/>
+            </w:tcMar>
+          </w:tcPr>
+          <w:p>
+            <w:pPr>
+              <w:spacing w:after="0" w:before="0" w:line="240"/>
+            </w:pPr>
+            <w:r>
+              <w:rPr>
+                <w:rFonts w:ascii="Calibri" w:cs="Calibri" w:eastAsia="Calibri" w:hAnsi="Calibri"/>
+                <w:b w:val="false"/>
+                <w:bCs w:val="false"/>
+                <w:sz w:val="18"/>
+                <w:szCs w:val="18"/>
+              </w:rPr>
+              <w:t>Wk 3 · Thu</w:t>
             </w:r>
           </w:p>
         </w:tc>
@@ -3583,27 +3697,26 @@
               <w:bottom w:val="single" w:color="D5DCE6" w:sz="4"/>
               <w:right w:val="single" w:color="D5DCE6" w:sz="4"/>
             </w:tcBorders>
-            <w:shd w:fill="F5F8FC" w:color="auto" w:val="clear"/>
-            <w:tcMar>
-              <w:top w:type="dxa" w:w="60"/>
-              <w:left w:type="dxa" w:w="100"/>
-              <w:bottom w:type="dxa" w:w="60"/>
-              <w:right w:type="dxa" w:w="100"/>
-            </w:tcMar>
-          </w:tcPr>
-          <w:p>
-            <w:pPr>
-              <w:spacing w:after="0" w:before="0" w:line="240"/>
-            </w:pPr>
-            <w:r>
-              <w:rPr>
-                <w:rFonts w:ascii="Calibri" w:cs="Calibri" w:eastAsia="Calibri" w:hAnsi="Calibri"/>
-                <w:b w:val="false"/>
-                <w:bCs w:val="false"/>
-                <w:sz w:val="18"/>
-                <w:szCs w:val="18"/>
-              </w:rPr>
-              <w:t xml:space="preserve">Book 3 — The Approval Limit</w:t>
+            <w:tcMar>
+              <w:top w:type="dxa" w:w="60"/>
+              <w:left w:type="dxa" w:w="100"/>
+              <w:bottom w:type="dxa" w:w="60"/>
+              <w:right w:type="dxa" w:w="100"/>
+            </w:tcMar>
+          </w:tcPr>
+          <w:p>
+            <w:pPr>
+              <w:spacing w:after="0" w:before="0" w:line="240"/>
+            </w:pPr>
+            <w:r>
+              <w:rPr>
+                <w:rFonts w:ascii="Calibri" w:cs="Calibri" w:eastAsia="Calibri" w:hAnsi="Calibri"/>
+                <w:b w:val="false"/>
+                <w:bCs w:val="false"/>
+                <w:sz w:val="18"/>
+                <w:szCs w:val="18"/>
+              </w:rPr>
+              <w:t>Book 14 — The Rule That Never Fired · then guided self-study: Book 23 — The Job That Stopped Running</w:t>
             </w:r>
           </w:p>
         </w:tc>
@@ -3616,27 +3729,25 @@
               <w:bottom w:val="single" w:color="D5DCE6" w:sz="4"/>
               <w:right w:val="single" w:color="D5DCE6" w:sz="4"/>
             </w:tcBorders>
-            <w:shd w:fill="F5F8FC" w:color="auto" w:val="clear"/>
-            <w:tcMar>
-              <w:top w:type="dxa" w:w="60"/>
-              <w:left w:type="dxa" w:w="100"/>
-              <w:bottom w:type="dxa" w:w="60"/>
-              <w:right w:type="dxa" w:w="100"/>
-            </w:tcMar>
-          </w:tcPr>
-          <w:p>
-            <w:pPr>
-              <w:spacing w:after="0" w:before="0" w:line="240"/>
-            </w:pPr>
-            <w:r>
-              <w:rPr>
-                <w:rFonts w:ascii="Calibri" w:cs="Calibri" w:eastAsia="Calibri" w:hAnsi="Calibri"/>
-                <w:b w:val="false"/>
-                <w:bCs w:val="false"/>
-                <w:sz w:val="18"/>
-                <w:szCs w:val="18"/>
-              </w:rPr>
-              <w:t xml:space="preserve"/>
+            <w:tcMar>
+              <w:top w:type="dxa" w:w="60"/>
+              <w:left w:type="dxa" w:w="100"/>
+              <w:bottom w:type="dxa" w:w="60"/>
+              <w:right w:type="dxa" w:w="100"/>
+            </w:tcMar>
+          </w:tcPr>
+          <w:p>
+            <w:pPr>
+              <w:spacing w:after="0" w:before="0" w:line="240"/>
+            </w:pPr>
+            <w:r>
+              <w:rPr>
+                <w:rFonts w:ascii="Calibri" w:cs="Calibri" w:eastAsia="Calibri" w:hAnsi="Calibri"/>
+                <w:b w:val="false"/>
+                <w:bCs w:val="false"/>
+                <w:sz w:val="18"/>
+                <w:szCs w:val="18"/>
+              </w:rPr>
             </w:r>
           </w:p>
         </w:tc>
@@ -3673,7 +3784,7 @@
                 <w:sz w:val="18"/>
                 <w:szCs w:val="18"/>
               </w:rPr>
-              <w:t xml:space="preserve">11</w:t>
+              <w:t>11</w:t>
             </w:r>
           </w:p>
         </w:tc>
@@ -3705,7 +3816,7 @@
                 <w:sz w:val="18"/>
                 <w:szCs w:val="18"/>
               </w:rPr>
-              <w:t xml:space="preserve">Wk 3 · Sat</w:t>
+              <w:t>Wk 3 · Sat</w:t>
             </w:r>
           </w:p>
         </w:tc>
@@ -3737,7 +3848,7 @@
                 <w:sz w:val="18"/>
                 <w:szCs w:val="18"/>
               </w:rPr>
-              <w:t xml:space="preserve">Midpoint — each trainee builds the Thornfield RCM from sessions 2–10</w:t>
+              <w:t>Book 3 — The Approval Limit</w:t>
             </w:r>
           </w:p>
         </w:tc>
@@ -3769,7 +3880,6 @@
                 <w:sz w:val="18"/>
                 <w:szCs w:val="18"/>
               </w:rPr>
-              <w:t xml:space="preserve">Midpoint RCM — every trainee drafts the Thornfield Risk &amp; Control Matrix</w:t>
             </w:r>
           </w:p>
         </w:tc>
@@ -3787,27 +3897,26 @@
               <w:bottom w:val="single" w:color="D5DCE6" w:sz="4"/>
               <w:right w:val="single" w:color="D5DCE6" w:sz="4"/>
             </w:tcBorders>
-            <w:shd w:fill="F5F8FC" w:color="auto" w:val="clear"/>
-            <w:tcMar>
-              <w:top w:type="dxa" w:w="60"/>
-              <w:left w:type="dxa" w:w="100"/>
-              <w:bottom w:type="dxa" w:w="60"/>
-              <w:right w:type="dxa" w:w="100"/>
-            </w:tcMar>
-          </w:tcPr>
-          <w:p>
-            <w:pPr>
-              <w:spacing w:after="0" w:before="0" w:line="240"/>
-            </w:pPr>
-            <w:r>
-              <w:rPr>
-                <w:rFonts w:ascii="Calibri" w:cs="Calibri" w:eastAsia="Calibri" w:hAnsi="Calibri"/>
-                <w:b w:val="false"/>
-                <w:bCs w:val="false"/>
-                <w:sz w:val="18"/>
-                <w:szCs w:val="18"/>
-              </w:rPr>
-              <w:t xml:space="preserve">12</w:t>
+            <w:tcMar>
+              <w:top w:type="dxa" w:w="60"/>
+              <w:left w:type="dxa" w:w="100"/>
+              <w:bottom w:type="dxa" w:w="60"/>
+              <w:right w:type="dxa" w:w="100"/>
+            </w:tcMar>
+          </w:tcPr>
+          <w:p>
+            <w:pPr>
+              <w:spacing w:after="0" w:before="0" w:line="240"/>
+            </w:pPr>
+            <w:r>
+              <w:rPr>
+                <w:rFonts w:ascii="Calibri" w:cs="Calibri" w:eastAsia="Calibri" w:hAnsi="Calibri"/>
+                <w:b w:val="false"/>
+                <w:bCs w:val="false"/>
+                <w:sz w:val="18"/>
+                <w:szCs w:val="18"/>
+              </w:rPr>
+              <w:t>12</w:t>
             </w:r>
           </w:p>
         </w:tc>
@@ -3820,27 +3929,26 @@
               <w:bottom w:val="single" w:color="D5DCE6" w:sz="4"/>
               <w:right w:val="single" w:color="D5DCE6" w:sz="4"/>
             </w:tcBorders>
-            <w:shd w:fill="F5F8FC" w:color="auto" w:val="clear"/>
-            <w:tcMar>
-              <w:top w:type="dxa" w:w="60"/>
-              <w:left w:type="dxa" w:w="100"/>
-              <w:bottom w:type="dxa" w:w="60"/>
-              <w:right w:type="dxa" w:w="100"/>
-            </w:tcMar>
-          </w:tcPr>
-          <w:p>
-            <w:pPr>
-              <w:spacing w:after="0" w:before="0" w:line="240"/>
-            </w:pPr>
-            <w:r>
-              <w:rPr>
-                <w:rFonts w:ascii="Calibri" w:cs="Calibri" w:eastAsia="Calibri" w:hAnsi="Calibri"/>
-                <w:b w:val="false"/>
-                <w:bCs w:val="false"/>
-                <w:sz w:val="18"/>
-                <w:szCs w:val="18"/>
-              </w:rPr>
-              <w:t xml:space="preserve">Wk 3 · Sun</w:t>
+            <w:tcMar>
+              <w:top w:type="dxa" w:w="60"/>
+              <w:left w:type="dxa" w:w="100"/>
+              <w:bottom w:type="dxa" w:w="60"/>
+              <w:right w:type="dxa" w:w="100"/>
+            </w:tcMar>
+          </w:tcPr>
+          <w:p>
+            <w:pPr>
+              <w:spacing w:after="0" w:before="0" w:line="240"/>
+            </w:pPr>
+            <w:r>
+              <w:rPr>
+                <w:rFonts w:ascii="Calibri" w:cs="Calibri" w:eastAsia="Calibri" w:hAnsi="Calibri"/>
+                <w:b w:val="false"/>
+                <w:bCs w:val="false"/>
+                <w:sz w:val="18"/>
+                <w:szCs w:val="18"/>
+              </w:rPr>
+              <w:t>Wk 3 · Sun</w:t>
             </w:r>
           </w:p>
         </w:tc>
@@ -3853,27 +3961,26 @@
               <w:bottom w:val="single" w:color="D5DCE6" w:sz="4"/>
               <w:right w:val="single" w:color="D5DCE6" w:sz="4"/>
             </w:tcBorders>
-            <w:shd w:fill="F5F8FC" w:color="auto" w:val="clear"/>
-            <w:tcMar>
-              <w:top w:type="dxa" w:w="60"/>
-              <w:left w:type="dxa" w:w="100"/>
-              <w:bottom w:type="dxa" w:w="60"/>
-              <w:right w:type="dxa" w:w="100"/>
-            </w:tcMar>
-          </w:tcPr>
-          <w:p>
-            <w:pPr>
-              <w:spacing w:after="0" w:before="0" w:line="240"/>
-            </w:pPr>
-            <w:r>
-              <w:rPr>
-                <w:rFonts w:ascii="Calibri" w:cs="Calibri" w:eastAsia="Calibri" w:hAnsi="Calibri"/>
-                <w:b w:val="false"/>
-                <w:bCs w:val="false"/>
-                <w:sz w:val="18"/>
-                <w:szCs w:val="18"/>
-              </w:rPr>
-              <w:t xml:space="preserve">Book 24 — The Match That Wasn't</w:t>
+            <w:tcMar>
+              <w:top w:type="dxa" w:w="60"/>
+              <w:left w:type="dxa" w:w="100"/>
+              <w:bottom w:type="dxa" w:w="60"/>
+              <w:right w:type="dxa" w:w="100"/>
+            </w:tcMar>
+          </w:tcPr>
+          <w:p>
+            <w:pPr>
+              <w:spacing w:after="0" w:before="0" w:line="240"/>
+            </w:pPr>
+            <w:r>
+              <w:rPr>
+                <w:rFonts w:ascii="Calibri" w:cs="Calibri" w:eastAsia="Calibri" w:hAnsi="Calibri"/>
+                <w:b w:val="false"/>
+                <w:bCs w:val="false"/>
+                <w:sz w:val="18"/>
+                <w:szCs w:val="18"/>
+              </w:rPr>
+              <w:t>Book 24 — The Match That Wasn't</w:t>
             </w:r>
           </w:p>
         </w:tc>
@@ -3886,27 +3993,25 @@
               <w:bottom w:val="single" w:color="D5DCE6" w:sz="4"/>
               <w:right w:val="single" w:color="D5DCE6" w:sz="4"/>
             </w:tcBorders>
-            <w:shd w:fill="F5F8FC" w:color="auto" w:val="clear"/>
-            <w:tcMar>
-              <w:top w:type="dxa" w:w="60"/>
-              <w:left w:type="dxa" w:w="100"/>
-              <w:bottom w:type="dxa" w:w="60"/>
-              <w:right w:type="dxa" w:w="100"/>
-            </w:tcMar>
-          </w:tcPr>
-          <w:p>
-            <w:pPr>
-              <w:spacing w:after="0" w:before="0" w:line="240"/>
-            </w:pPr>
-            <w:r>
-              <w:rPr>
-                <w:rFonts w:ascii="Calibri" w:cs="Calibri" w:eastAsia="Calibri" w:hAnsi="Calibri"/>
-                <w:b w:val="false"/>
-                <w:bCs w:val="false"/>
-                <w:sz w:val="18"/>
-                <w:szCs w:val="18"/>
-              </w:rPr>
-              <w:t xml:space="preserve"/>
+            <w:tcMar>
+              <w:top w:type="dxa" w:w="60"/>
+              <w:left w:type="dxa" w:w="100"/>
+              <w:bottom w:type="dxa" w:w="60"/>
+              <w:right w:type="dxa" w:w="100"/>
+            </w:tcMar>
+          </w:tcPr>
+          <w:p>
+            <w:pPr>
+              <w:spacing w:after="0" w:before="0" w:line="240"/>
+            </w:pPr>
+            <w:r>
+              <w:rPr>
+                <w:rFonts w:ascii="Calibri" w:cs="Calibri" w:eastAsia="Calibri" w:hAnsi="Calibri"/>
+                <w:b w:val="false"/>
+                <w:bCs w:val="false"/>
+                <w:sz w:val="18"/>
+                <w:szCs w:val="18"/>
+              </w:rPr>
             </w:r>
           </w:p>
         </w:tc>
@@ -3943,7 +4048,7 @@
                 <w:sz w:val="18"/>
                 <w:szCs w:val="18"/>
               </w:rPr>
-              <w:t xml:space="preserve">13</w:t>
+              <w:t>13</w:t>
             </w:r>
           </w:p>
         </w:tc>
@@ -3975,7 +4080,7 @@
                 <w:sz w:val="18"/>
                 <w:szCs w:val="18"/>
               </w:rPr>
-              <w:t xml:space="preserve">Wk 4 · Tue</w:t>
+              <w:t>Wk 4 · Tue</w:t>
             </w:r>
           </w:p>
         </w:tc>
@@ -4007,7 +4112,7 @@
                 <w:sz w:val="18"/>
                 <w:szCs w:val="18"/>
               </w:rPr>
-              <w:t xml:space="preserve">Book 25 — The File That Left Twice</w:t>
+              <w:t>Book 25 — The File That Left Twice</w:t>
             </w:r>
           </w:p>
         </w:tc>
@@ -4039,7 +4144,7 @@
                 <w:sz w:val="18"/>
                 <w:szCs w:val="18"/>
               </w:rPr>
-              <w:t xml:space="preserve">Workpaper 2 returned marked</w:t>
+              <w:t>Workpaper 3 (ITAC — P2P / OTC) assigned — due before session 16 · Workpaper 2 returned marked</w:t>
             </w:r>
           </w:p>
         </w:tc>
@@ -4057,27 +4162,26 @@
               <w:bottom w:val="single" w:color="D5DCE6" w:sz="4"/>
               <w:right w:val="single" w:color="D5DCE6" w:sz="4"/>
             </w:tcBorders>
-            <w:shd w:fill="F5F8FC" w:color="auto" w:val="clear"/>
-            <w:tcMar>
-              <w:top w:type="dxa" w:w="60"/>
-              <w:left w:type="dxa" w:w="100"/>
-              <w:bottom w:type="dxa" w:w="60"/>
-              <w:right w:type="dxa" w:w="100"/>
-            </w:tcMar>
-          </w:tcPr>
-          <w:p>
-            <w:pPr>
-              <w:spacing w:after="0" w:before="0" w:line="240"/>
-            </w:pPr>
-            <w:r>
-              <w:rPr>
-                <w:rFonts w:ascii="Calibri" w:cs="Calibri" w:eastAsia="Calibri" w:hAnsi="Calibri"/>
-                <w:b w:val="false"/>
-                <w:bCs w:val="false"/>
-                <w:sz w:val="18"/>
-                <w:szCs w:val="18"/>
-              </w:rPr>
-              <w:t xml:space="preserve">14</w:t>
+            <w:tcMar>
+              <w:top w:type="dxa" w:w="60"/>
+              <w:left w:type="dxa" w:w="100"/>
+              <w:bottom w:type="dxa" w:w="60"/>
+              <w:right w:type="dxa" w:w="100"/>
+            </w:tcMar>
+          </w:tcPr>
+          <w:p>
+            <w:pPr>
+              <w:spacing w:after="0" w:before="0" w:line="240"/>
+            </w:pPr>
+            <w:r>
+              <w:rPr>
+                <w:rFonts w:ascii="Calibri" w:cs="Calibri" w:eastAsia="Calibri" w:hAnsi="Calibri"/>
+                <w:b w:val="false"/>
+                <w:bCs w:val="false"/>
+                <w:sz w:val="18"/>
+                <w:szCs w:val="18"/>
+              </w:rPr>
+              <w:t>14</w:t>
             </w:r>
           </w:p>
         </w:tc>
@@ -4090,27 +4194,26 @@
               <w:bottom w:val="single" w:color="D5DCE6" w:sz="4"/>
               <w:right w:val="single" w:color="D5DCE6" w:sz="4"/>
             </w:tcBorders>
-            <w:shd w:fill="F5F8FC" w:color="auto" w:val="clear"/>
-            <w:tcMar>
-              <w:top w:type="dxa" w:w="60"/>
-              <w:left w:type="dxa" w:w="100"/>
-              <w:bottom w:type="dxa" w:w="60"/>
-              <w:right w:type="dxa" w:w="100"/>
-            </w:tcMar>
-          </w:tcPr>
-          <w:p>
-            <w:pPr>
-              <w:spacing w:after="0" w:before="0" w:line="240"/>
-            </w:pPr>
-            <w:r>
-              <w:rPr>
-                <w:rFonts w:ascii="Calibri" w:cs="Calibri" w:eastAsia="Calibri" w:hAnsi="Calibri"/>
-                <w:b w:val="false"/>
-                <w:bCs w:val="false"/>
-                <w:sz w:val="18"/>
-                <w:szCs w:val="18"/>
-              </w:rPr>
-              <w:t xml:space="preserve">Wk 4 · Thu</w:t>
+            <w:tcMar>
+              <w:top w:type="dxa" w:w="60"/>
+              <w:left w:type="dxa" w:w="100"/>
+              <w:bottom w:type="dxa" w:w="60"/>
+              <w:right w:type="dxa" w:w="100"/>
+            </w:tcMar>
+          </w:tcPr>
+          <w:p>
+            <w:pPr>
+              <w:spacing w:after="0" w:before="0" w:line="240"/>
+            </w:pPr>
+            <w:r>
+              <w:rPr>
+                <w:rFonts w:ascii="Calibri" w:cs="Calibri" w:eastAsia="Calibri" w:hAnsi="Calibri"/>
+                <w:b w:val="false"/>
+                <w:bCs w:val="false"/>
+                <w:sz w:val="18"/>
+                <w:szCs w:val="18"/>
+              </w:rPr>
+              <w:t>Wk 4 · Thu</w:t>
             </w:r>
           </w:p>
         </w:tc>
@@ -4123,27 +4226,26 @@
               <w:bottom w:val="single" w:color="D5DCE6" w:sz="4"/>
               <w:right w:val="single" w:color="D5DCE6" w:sz="4"/>
             </w:tcBorders>
-            <w:shd w:fill="F5F8FC" w:color="auto" w:val="clear"/>
-            <w:tcMar>
-              <w:top w:type="dxa" w:w="60"/>
-              <w:left w:type="dxa" w:w="100"/>
-              <w:bottom w:type="dxa" w:w="60"/>
-              <w:right w:type="dxa" w:w="100"/>
-            </w:tcMar>
-          </w:tcPr>
-          <w:p>
-            <w:pPr>
-              <w:spacing w:after="0" w:before="0" w:line="240"/>
-            </w:pPr>
-            <w:r>
-              <w:rPr>
-                <w:rFonts w:ascii="Calibri" w:cs="Calibri" w:eastAsia="Calibri" w:hAnsi="Calibri"/>
-                <w:b w:val="false"/>
-                <w:bCs w:val="false"/>
-                <w:sz w:val="18"/>
-                <w:szCs w:val="18"/>
-              </w:rPr>
-              <w:t xml:space="preserve">Book 26 — The Bank Detail Nobody Approved</w:t>
+            <w:tcMar>
+              <w:top w:type="dxa" w:w="60"/>
+              <w:left w:type="dxa" w:w="100"/>
+              <w:bottom w:type="dxa" w:w="60"/>
+              <w:right w:type="dxa" w:w="100"/>
+            </w:tcMar>
+          </w:tcPr>
+          <w:p>
+            <w:pPr>
+              <w:spacing w:after="0" w:before="0" w:line="240"/>
+            </w:pPr>
+            <w:r>
+              <w:rPr>
+                <w:rFonts w:ascii="Calibri" w:cs="Calibri" w:eastAsia="Calibri" w:hAnsi="Calibri"/>
+                <w:b w:val="false"/>
+                <w:bCs w:val="false"/>
+                <w:sz w:val="18"/>
+                <w:szCs w:val="18"/>
+              </w:rPr>
+              <w:t>Book 26 — The Bank Detail Nobody Approved · then guided self-study: Book 27 — The Tolerance That Swallowed It</w:t>
             </w:r>
           </w:p>
         </w:tc>
@@ -4156,27 +4258,25 @@
               <w:bottom w:val="single" w:color="D5DCE6" w:sz="4"/>
               <w:right w:val="single" w:color="D5DCE6" w:sz="4"/>
             </w:tcBorders>
-            <w:shd w:fill="F5F8FC" w:color="auto" w:val="clear"/>
-            <w:tcMar>
-              <w:top w:type="dxa" w:w="60"/>
-              <w:left w:type="dxa" w:w="100"/>
-              <w:bottom w:type="dxa" w:w="60"/>
-              <w:right w:type="dxa" w:w="100"/>
-            </w:tcMar>
-          </w:tcPr>
-          <w:p>
-            <w:pPr>
-              <w:spacing w:after="0" w:before="0" w:line="240"/>
-            </w:pPr>
-            <w:r>
-              <w:rPr>
-                <w:rFonts w:ascii="Calibri" w:cs="Calibri" w:eastAsia="Calibri" w:hAnsi="Calibri"/>
-                <w:b w:val="false"/>
-                <w:bCs w:val="false"/>
-                <w:sz w:val="18"/>
-                <w:szCs w:val="18"/>
-              </w:rPr>
-              <w:t xml:space="preserve"/>
+            <w:tcMar>
+              <w:top w:type="dxa" w:w="60"/>
+              <w:left w:type="dxa" w:w="100"/>
+              <w:bottom w:type="dxa" w:w="60"/>
+              <w:right w:type="dxa" w:w="100"/>
+            </w:tcMar>
+          </w:tcPr>
+          <w:p>
+            <w:pPr>
+              <w:spacing w:after="0" w:before="0" w:line="240"/>
+            </w:pPr>
+            <w:r>
+              <w:rPr>
+                <w:rFonts w:ascii="Calibri" w:cs="Calibri" w:eastAsia="Calibri" w:hAnsi="Calibri"/>
+                <w:b w:val="false"/>
+                <w:bCs w:val="false"/>
+                <w:sz w:val="18"/>
+                <w:szCs w:val="18"/>
+              </w:rPr>
             </w:r>
           </w:p>
         </w:tc>
@@ -4213,7 +4313,7 @@
                 <w:sz w:val="18"/>
                 <w:szCs w:val="18"/>
               </w:rPr>
-              <w:t xml:space="preserve">15</w:t>
+              <w:t>15</w:t>
             </w:r>
           </w:p>
         </w:tc>
@@ -4245,7 +4345,7 @@
                 <w:sz w:val="18"/>
                 <w:szCs w:val="18"/>
               </w:rPr>
-              <w:t xml:space="preserve">Wk 4 · Sat</w:t>
+              <w:t>Wk 4 · Sat</w:t>
             </w:r>
           </w:p>
         </w:tc>
@@ -4277,7 +4377,7 @@
                 <w:sz w:val="18"/>
                 <w:szCs w:val="18"/>
               </w:rPr>
-              <w:t xml:space="preserve">Book 27 — The Tolerance That Swallowed It</w:t>
+              <w:t>Book 29 — The Held Order</w:t>
             </w:r>
           </w:p>
         </w:tc>
@@ -4309,7 +4409,6 @@
                 <w:sz w:val="18"/>
                 <w:szCs w:val="18"/>
               </w:rPr>
-              <w:t xml:space="preserve"/>
             </w:r>
           </w:p>
         </w:tc>
@@ -4327,27 +4426,26 @@
               <w:bottom w:val="single" w:color="D5DCE6" w:sz="4"/>
               <w:right w:val="single" w:color="D5DCE6" w:sz="4"/>
             </w:tcBorders>
-            <w:shd w:fill="F5F8FC" w:color="auto" w:val="clear"/>
-            <w:tcMar>
-              <w:top w:type="dxa" w:w="60"/>
-              <w:left w:type="dxa" w:w="100"/>
-              <w:bottom w:type="dxa" w:w="60"/>
-              <w:right w:type="dxa" w:w="100"/>
-            </w:tcMar>
-          </w:tcPr>
-          <w:p>
-            <w:pPr>
-              <w:spacing w:after="0" w:before="0" w:line="240"/>
-            </w:pPr>
-            <w:r>
-              <w:rPr>
-                <w:rFonts w:ascii="Calibri" w:cs="Calibri" w:eastAsia="Calibri" w:hAnsi="Calibri"/>
-                <w:b w:val="false"/>
-                <w:bCs w:val="false"/>
-                <w:sz w:val="18"/>
-                <w:szCs w:val="18"/>
-              </w:rPr>
-              <w:t xml:space="preserve">16</w:t>
+            <w:tcMar>
+              <w:top w:type="dxa" w:w="60"/>
+              <w:left w:type="dxa" w:w="100"/>
+              <w:bottom w:type="dxa" w:w="60"/>
+              <w:right w:type="dxa" w:w="100"/>
+            </w:tcMar>
+          </w:tcPr>
+          <w:p>
+            <w:pPr>
+              <w:spacing w:after="0" w:before="0" w:line="240"/>
+            </w:pPr>
+            <w:r>
+              <w:rPr>
+                <w:rFonts w:ascii="Calibri" w:cs="Calibri" w:eastAsia="Calibri" w:hAnsi="Calibri"/>
+                <w:b w:val="false"/>
+                <w:bCs w:val="false"/>
+                <w:sz w:val="18"/>
+                <w:szCs w:val="18"/>
+              </w:rPr>
+              <w:t>16</w:t>
             </w:r>
           </w:p>
         </w:tc>
@@ -4360,27 +4458,26 @@
               <w:bottom w:val="single" w:color="D5DCE6" w:sz="4"/>
               <w:right w:val="single" w:color="D5DCE6" w:sz="4"/>
             </w:tcBorders>
-            <w:shd w:fill="F5F8FC" w:color="auto" w:val="clear"/>
-            <w:tcMar>
-              <w:top w:type="dxa" w:w="60"/>
-              <w:left w:type="dxa" w:w="100"/>
-              <w:bottom w:type="dxa" w:w="60"/>
-              <w:right w:type="dxa" w:w="100"/>
-            </w:tcMar>
-          </w:tcPr>
-          <w:p>
-            <w:pPr>
-              <w:spacing w:after="0" w:before="0" w:line="240"/>
-            </w:pPr>
-            <w:r>
-              <w:rPr>
-                <w:rFonts w:ascii="Calibri" w:cs="Calibri" w:eastAsia="Calibri" w:hAnsi="Calibri"/>
-                <w:b w:val="false"/>
-                <w:bCs w:val="false"/>
-                <w:sz w:val="18"/>
-                <w:szCs w:val="18"/>
-              </w:rPr>
-              <w:t xml:space="preserve">Wk 4 · Sun</w:t>
+            <w:tcMar>
+              <w:top w:type="dxa" w:w="60"/>
+              <w:left w:type="dxa" w:w="100"/>
+              <w:bottom w:type="dxa" w:w="60"/>
+              <w:right w:type="dxa" w:w="100"/>
+            </w:tcMar>
+          </w:tcPr>
+          <w:p>
+            <w:pPr>
+              <w:spacing w:after="0" w:before="0" w:line="240"/>
+            </w:pPr>
+            <w:r>
+              <w:rPr>
+                <w:rFonts w:ascii="Calibri" w:cs="Calibri" w:eastAsia="Calibri" w:hAnsi="Calibri"/>
+                <w:b w:val="false"/>
+                <w:bCs w:val="false"/>
+                <w:sz w:val="18"/>
+                <w:szCs w:val="18"/>
+              </w:rPr>
+              <w:t>Wk 4 · Sun</w:t>
             </w:r>
           </w:p>
         </w:tc>
@@ -4393,27 +4490,26 @@
               <w:bottom w:val="single" w:color="D5DCE6" w:sz="4"/>
               <w:right w:val="single" w:color="D5DCE6" w:sz="4"/>
             </w:tcBorders>
-            <w:shd w:fill="F5F8FC" w:color="auto" w:val="clear"/>
-            <w:tcMar>
-              <w:top w:type="dxa" w:w="60"/>
-              <w:left w:type="dxa" w:w="100"/>
-              <w:bottom w:type="dxa" w:w="60"/>
-              <w:right w:type="dxa" w:w="100"/>
-            </w:tcMar>
-          </w:tcPr>
-          <w:p>
-            <w:pPr>
-              <w:spacing w:after="0" w:before="0" w:line="240"/>
-            </w:pPr>
-            <w:r>
-              <w:rPr>
-                <w:rFonts w:ascii="Calibri" w:cs="Calibri" w:eastAsia="Calibri" w:hAnsi="Calibri"/>
-                <w:b w:val="false"/>
-                <w:bCs w:val="false"/>
-                <w:sz w:val="18"/>
-                <w:szCs w:val="18"/>
-              </w:rPr>
-              <w:t xml:space="preserve">Book 29 — The Held Order</w:t>
+            <w:tcMar>
+              <w:top w:type="dxa" w:w="60"/>
+              <w:left w:type="dxa" w:w="100"/>
+              <w:bottom w:type="dxa" w:w="60"/>
+              <w:right w:type="dxa" w:w="100"/>
+            </w:tcMar>
+          </w:tcPr>
+          <w:p>
+            <w:pPr>
+              <w:spacing w:after="0" w:before="0" w:line="240"/>
+            </w:pPr>
+            <w:r>
+              <w:rPr>
+                <w:rFonts w:ascii="Calibri" w:cs="Calibri" w:eastAsia="Calibri" w:hAnsi="Calibri"/>
+                <w:b w:val="false"/>
+                <w:bCs w:val="false"/>
+                <w:sz w:val="18"/>
+                <w:szCs w:val="18"/>
+              </w:rPr>
+              <w:t>Book 30 — The Early Invoice</w:t>
             </w:r>
           </w:p>
         </w:tc>
@@ -4426,27 +4522,203 @@
               <w:bottom w:val="single" w:color="D5DCE6" w:sz="4"/>
               <w:right w:val="single" w:color="D5DCE6" w:sz="4"/>
             </w:tcBorders>
-            <w:shd w:fill="F5F8FC" w:color="auto" w:val="clear"/>
-            <w:tcMar>
-              <w:top w:type="dxa" w:w="60"/>
-              <w:left w:type="dxa" w:w="100"/>
-              <w:bottom w:type="dxa" w:w="60"/>
-              <w:right w:type="dxa" w:w="100"/>
-            </w:tcMar>
-          </w:tcPr>
-          <w:p>
-            <w:pPr>
-              <w:spacing w:after="0" w:before="0" w:line="240"/>
-            </w:pPr>
-            <w:r>
-              <w:rPr>
-                <w:rFonts w:ascii="Calibri" w:cs="Calibri" w:eastAsia="Calibri" w:hAnsi="Calibri"/>
-                <w:b w:val="false"/>
-                <w:bCs w:val="false"/>
-                <w:sz w:val="18"/>
-                <w:szCs w:val="18"/>
-              </w:rPr>
-              <w:t xml:space="preserve"/>
+            <w:tcMar>
+              <w:top w:type="dxa" w:w="60"/>
+              <w:left w:type="dxa" w:w="100"/>
+              <w:bottom w:type="dxa" w:w="60"/>
+              <w:right w:type="dxa" w:w="100"/>
+            </w:tcMar>
+          </w:tcPr>
+          <w:p>
+            <w:pPr>
+              <w:spacing w:after="0" w:before="0" w:line="240"/>
+            </w:pPr>
+            <w:r>
+              <w:rPr>
+                <w:rFonts w:ascii="Calibri" w:cs="Calibri" w:eastAsia="Calibri" w:hAnsi="Calibri"/>
+                <w:b w:val="false"/>
+                <w:bCs w:val="false"/>
+                <w:sz w:val="18"/>
+                <w:szCs w:val="18"/>
+              </w:rPr>
+              <w:t>Workpaper 3 due · returned marked within a week · Intermediate certificate</w:t>
+            </w:r>
+          </w:p>
+        </w:tc>
+      </w:tr>
+    </w:tbl>
+    <w:p>
+      <w:pPr>
+        <w:pStyle w:val="Heading2"/>
+        <w:spacing w:after="80" w:before="180" w:line="240"/>
+      </w:pPr>
+      <w:r>
+        <w:rPr>
+          <w:rFonts w:ascii="Cambria" w:cs="Cambria" w:eastAsia="Cambria" w:hAnsi="Cambria"/>
+          <w:b/>
+          <w:bCs/>
+          <w:color w:val="1B3358"/>
+          <w:sz w:val="24"/>
+          <w:szCs w:val="24"/>
+        </w:rPr>
+        <w:t>Advanced — 12 sessions</w:t>
+      </w:r>
+    </w:p>
+    <w:tbl>
+      <w:tblPr>
+        <w:tblW w:type="dxa" w:w="10080"/>
+        <w:tblBorders>
+          <w:top w:val="single" w:color="auto" w:sz="4"/>
+          <w:left w:val="single" w:color="auto" w:sz="4"/>
+          <w:bottom w:val="single" w:color="auto" w:sz="4"/>
+          <w:right w:val="single" w:color="auto" w:sz="4"/>
+          <w:insideH w:val="single" w:color="auto" w:sz="4"/>
+          <w:insideV w:val="single" w:color="auto" w:sz="4"/>
+        </w:tblBorders>
+      </w:tblPr>
+      <w:tblGrid>
+        <w:gridCol w:w="700"/>
+        <w:gridCol w:w="1100"/>
+        <w:gridCol w:w="5300"/>
+        <w:gridCol w:w="2980"/>
+      </w:tblGrid>
+      <w:tr>
+        <w:trPr>
+          <w:tblHeader/>
+        </w:trPr>
+        <w:tc>
+          <w:tcPr>
+            <w:tcW w:type="dxa" w:w="700"/>
+            <w:tcBorders>
+              <w:top w:val="single" w:color="D5DCE6" w:sz="4"/>
+              <w:left w:val="single" w:color="D5DCE6" w:sz="4"/>
+              <w:bottom w:val="single" w:color="D5DCE6" w:sz="4"/>
+              <w:right w:val="single" w:color="D5DCE6" w:sz="4"/>
+            </w:tcBorders>
+            <w:shd w:fill="1B3358" w:color="auto" w:val="clear"/>
+            <w:tcMar>
+              <w:top w:type="dxa" w:w="60"/>
+              <w:left w:type="dxa" w:w="100"/>
+              <w:bottom w:type="dxa" w:w="60"/>
+              <w:right w:type="dxa" w:w="100"/>
+            </w:tcMar>
+          </w:tcPr>
+          <w:p>
+            <w:pPr>
+              <w:spacing w:after="0" w:before="0" w:line="240"/>
+            </w:pPr>
+            <w:r>
+              <w:rPr>
+                <w:rFonts w:ascii="Calibri" w:cs="Calibri" w:eastAsia="Calibri" w:hAnsi="Calibri"/>
+                <w:b/>
+                <w:bCs/>
+                <w:color w:val="FFFFFF"/>
+                <w:sz w:val="18"/>
+                <w:szCs w:val="18"/>
+              </w:rPr>
+              <w:t xml:space="preserve">#</w:t>
+            </w:r>
+          </w:p>
+        </w:tc>
+        <w:tc>
+          <w:tcPr>
+            <w:tcW w:type="dxa" w:w="1100"/>
+            <w:tcBorders>
+              <w:top w:val="single" w:color="D5DCE6" w:sz="4"/>
+              <w:left w:val="single" w:color="D5DCE6" w:sz="4"/>
+              <w:bottom w:val="single" w:color="D5DCE6" w:sz="4"/>
+              <w:right w:val="single" w:color="D5DCE6" w:sz="4"/>
+            </w:tcBorders>
+            <w:shd w:fill="1B3358" w:color="auto" w:val="clear"/>
+            <w:tcMar>
+              <w:top w:type="dxa" w:w="60"/>
+              <w:left w:type="dxa" w:w="100"/>
+              <w:bottom w:type="dxa" w:w="60"/>
+              <w:right w:type="dxa" w:w="100"/>
+            </w:tcMar>
+          </w:tcPr>
+          <w:p>
+            <w:pPr>
+              <w:spacing w:after="0" w:before="0" w:line="240"/>
+            </w:pPr>
+            <w:r>
+              <w:rPr>
+                <w:rFonts w:ascii="Calibri" w:cs="Calibri" w:eastAsia="Calibri" w:hAnsi="Calibri"/>
+                <w:b/>
+                <w:bCs/>
+                <w:color w:val="FFFFFF"/>
+                <w:sz w:val="18"/>
+                <w:szCs w:val="18"/>
+              </w:rPr>
+              <w:t xml:space="preserve">Week · Day</w:t>
+            </w:r>
+          </w:p>
+        </w:tc>
+        <w:tc>
+          <w:tcPr>
+            <w:tcW w:type="dxa" w:w="5300"/>
+            <w:tcBorders>
+              <w:top w:val="single" w:color="D5DCE6" w:sz="4"/>
+              <w:left w:val="single" w:color="D5DCE6" w:sz="4"/>
+              <w:bottom w:val="single" w:color="D5DCE6" w:sz="4"/>
+              <w:right w:val="single" w:color="D5DCE6" w:sz="4"/>
+            </w:tcBorders>
+            <w:shd w:fill="1B3358" w:color="auto" w:val="clear"/>
+            <w:tcMar>
+              <w:top w:type="dxa" w:w="60"/>
+              <w:left w:type="dxa" w:w="100"/>
+              <w:bottom w:type="dxa" w:w="60"/>
+              <w:right w:type="dxa" w:w="100"/>
+            </w:tcMar>
+          </w:tcPr>
+          <w:p>
+            <w:pPr>
+              <w:spacing w:after="0" w:before="0" w:line="240"/>
+            </w:pPr>
+            <w:r>
+              <w:rPr>
+                <w:rFonts w:ascii="Calibri" w:cs="Calibri" w:eastAsia="Calibri" w:hAnsi="Calibri"/>
+                <w:b/>
+                <w:bCs/>
+                <w:color w:val="FFFFFF"/>
+                <w:sz w:val="18"/>
+                <w:szCs w:val="18"/>
+              </w:rPr>
+              <w:t xml:space="preserve">Content</w:t>
+            </w:r>
+          </w:p>
+        </w:tc>
+        <w:tc>
+          <w:tcPr>
+            <w:tcW w:type="dxa" w:w="2980"/>
+            <w:tcBorders>
+              <w:top w:val="single" w:color="D5DCE6" w:sz="4"/>
+              <w:left w:val="single" w:color="D5DCE6" w:sz="4"/>
+              <w:bottom w:val="single" w:color="D5DCE6" w:sz="4"/>
+              <w:right w:val="single" w:color="D5DCE6" w:sz="4"/>
+            </w:tcBorders>
+            <w:shd w:fill="1B3358" w:color="auto" w:val="clear"/>
+            <w:tcMar>
+              <w:top w:type="dxa" w:w="60"/>
+              <w:left w:type="dxa" w:w="100"/>
+              <w:bottom w:type="dxa" w:w="60"/>
+              <w:right w:type="dxa" w:w="100"/>
+            </w:tcMar>
+          </w:tcPr>
+          <w:p>
+            <w:pPr>
+              <w:spacing w:after="0" w:before="0" w:line="240"/>
+            </w:pPr>
+            <w:r>
+              <w:rPr>
+                <w:rFonts w:ascii="Calibri" w:cs="Calibri" w:eastAsia="Calibri" w:hAnsi="Calibri"/>
+                <w:b/>
+                <w:bCs/>
+                <w:color w:val="FFFFFF"/>
+                <w:sz w:val="18"/>
+                <w:szCs w:val="18"/>
+              </w:rPr>
+              <w:t xml:space="preserve">Graded work</w:t>
             </w:r>
           </w:p>
         </w:tc>
@@ -4483,7 +4755,7 @@
                 <w:sz w:val="18"/>
                 <w:szCs w:val="18"/>
               </w:rPr>
-              <w:t xml:space="preserve">17</w:t>
+              <w:t>1</w:t>
             </w:r>
           </w:p>
         </w:tc>
@@ -4515,7 +4787,7 @@
                 <w:sz w:val="18"/>
                 <w:szCs w:val="18"/>
               </w:rPr>
-              <w:t xml:space="preserve">Wk 5 · Tue</w:t>
+              <w:t>Wk 1 · Tue</w:t>
             </w:r>
           </w:p>
         </w:tc>
@@ -4547,7 +4819,7 @@
                 <w:sz w:val="18"/>
                 <w:szCs w:val="18"/>
               </w:rPr>
-              <w:t xml:space="preserve">Book 30 — The Early Invoice</w:t>
+              <w:t>Bridge — entry check</w:t>
             </w:r>
           </w:p>
         </w:tc>
@@ -4579,7 +4851,7 @@
                 <w:sz w:val="18"/>
                 <w:szCs w:val="18"/>
               </w:rPr>
-              <w:t xml:space="preserve">Workpaper 3 (ITAC / Order-to-Cash) assigned — due before session 19</w:t>
+              <w:t>Entry check (Intermediate certificate or experience review)</w:t>
             </w:r>
           </w:p>
         </w:tc>
@@ -4597,27 +4869,26 @@
               <w:bottom w:val="single" w:color="D5DCE6" w:sz="4"/>
               <w:right w:val="single" w:color="D5DCE6" w:sz="4"/>
             </w:tcBorders>
-            <w:shd w:fill="F5F8FC" w:color="auto" w:val="clear"/>
-            <w:tcMar>
-              <w:top w:type="dxa" w:w="60"/>
-              <w:left w:type="dxa" w:w="100"/>
-              <w:bottom w:type="dxa" w:w="60"/>
-              <w:right w:type="dxa" w:w="100"/>
-            </w:tcMar>
-          </w:tcPr>
-          <w:p>
-            <w:pPr>
-              <w:spacing w:after="0" w:before="0" w:line="240"/>
-            </w:pPr>
-            <w:r>
-              <w:rPr>
-                <w:rFonts w:ascii="Calibri" w:cs="Calibri" w:eastAsia="Calibri" w:hAnsi="Calibri"/>
-                <w:b w:val="false"/>
-                <w:bCs w:val="false"/>
-                <w:sz w:val="18"/>
-                <w:szCs w:val="18"/>
-              </w:rPr>
-              <w:t xml:space="preserve">18</w:t>
+            <w:tcMar>
+              <w:top w:type="dxa" w:w="60"/>
+              <w:left w:type="dxa" w:w="100"/>
+              <w:bottom w:type="dxa" w:w="60"/>
+              <w:right w:type="dxa" w:w="100"/>
+            </w:tcMar>
+          </w:tcPr>
+          <w:p>
+            <w:pPr>
+              <w:spacing w:after="0" w:before="0" w:line="240"/>
+            </w:pPr>
+            <w:r>
+              <w:rPr>
+                <w:rFonts w:ascii="Calibri" w:cs="Calibri" w:eastAsia="Calibri" w:hAnsi="Calibri"/>
+                <w:b w:val="false"/>
+                <w:bCs w:val="false"/>
+                <w:sz w:val="18"/>
+                <w:szCs w:val="18"/>
+              </w:rPr>
+              <w:t>2</w:t>
             </w:r>
           </w:p>
         </w:tc>
@@ -4630,27 +4901,26 @@
               <w:bottom w:val="single" w:color="D5DCE6" w:sz="4"/>
               <w:right w:val="single" w:color="D5DCE6" w:sz="4"/>
             </w:tcBorders>
-            <w:shd w:fill="F5F8FC" w:color="auto" w:val="clear"/>
-            <w:tcMar>
-              <w:top w:type="dxa" w:w="60"/>
-              <w:left w:type="dxa" w:w="100"/>
-              <w:bottom w:type="dxa" w:w="60"/>
-              <w:right w:type="dxa" w:w="100"/>
-            </w:tcMar>
-          </w:tcPr>
-          <w:p>
-            <w:pPr>
-              <w:spacing w:after="0" w:before="0" w:line="240"/>
-            </w:pPr>
-            <w:r>
-              <w:rPr>
-                <w:rFonts w:ascii="Calibri" w:cs="Calibri" w:eastAsia="Calibri" w:hAnsi="Calibri"/>
-                <w:b w:val="false"/>
-                <w:bCs w:val="false"/>
-                <w:sz w:val="18"/>
-                <w:szCs w:val="18"/>
-              </w:rPr>
-              <w:t xml:space="preserve">Wk 5 · Thu</w:t>
+            <w:tcMar>
+              <w:top w:type="dxa" w:w="60"/>
+              <w:left w:type="dxa" w:w="100"/>
+              <w:bottom w:type="dxa" w:w="60"/>
+              <w:right w:type="dxa" w:w="100"/>
+            </w:tcMar>
+          </w:tcPr>
+          <w:p>
+            <w:pPr>
+              <w:spacing w:after="0" w:before="0" w:line="240"/>
+            </w:pPr>
+            <w:r>
+              <w:rPr>
+                <w:rFonts w:ascii="Calibri" w:cs="Calibri" w:eastAsia="Calibri" w:hAnsi="Calibri"/>
+                <w:b w:val="false"/>
+                <w:bCs w:val="false"/>
+                <w:sz w:val="18"/>
+                <w:szCs w:val="18"/>
+              </w:rPr>
+              <w:t>Wk 1 · Thu</w:t>
             </w:r>
           </w:p>
         </w:tc>
@@ -4663,27 +4933,26 @@
               <w:bottom w:val="single" w:color="D5DCE6" w:sz="4"/>
               <w:right w:val="single" w:color="D5DCE6" w:sz="4"/>
             </w:tcBorders>
-            <w:shd w:fill="F5F8FC" w:color="auto" w:val="clear"/>
-            <w:tcMar>
-              <w:top w:type="dxa" w:w="60"/>
-              <w:left w:type="dxa" w:w="100"/>
-              <w:bottom w:type="dxa" w:w="60"/>
-              <w:right w:type="dxa" w:w="100"/>
-            </w:tcMar>
-          </w:tcPr>
-          <w:p>
-            <w:pPr>
-              <w:spacing w:after="0" w:before="0" w:line="240"/>
-            </w:pPr>
-            <w:r>
-              <w:rPr>
-                <w:rFonts w:ascii="Calibri" w:cs="Calibri" w:eastAsia="Calibri" w:hAnsi="Calibri"/>
-                <w:b w:val="false"/>
-                <w:bCs w:val="false"/>
-                <w:sz w:val="18"/>
-                <w:szCs w:val="18"/>
-              </w:rPr>
-              <w:t xml:space="preserve">Book 37 — The Control That Was Never Built to Hold + Book 38 — How Many Is Enough</w:t>
+            <w:tcMar>
+              <w:top w:type="dxa" w:w="60"/>
+              <w:left w:type="dxa" w:w="100"/>
+              <w:bottom w:type="dxa" w:w="60"/>
+              <w:right w:type="dxa" w:w="100"/>
+            </w:tcMar>
+          </w:tcPr>
+          <w:p>
+            <w:pPr>
+              <w:spacing w:after="0" w:before="0" w:line="240"/>
+            </w:pPr>
+            <w:r>
+              <w:rPr>
+                <w:rFonts w:ascii="Calibri" w:cs="Calibri" w:eastAsia="Calibri" w:hAnsi="Calibri"/>
+                <w:b w:val="false"/>
+                <w:bCs w:val="false"/>
+                <w:sz w:val="18"/>
+                <w:szCs w:val="18"/>
+              </w:rPr>
+              <w:t>Book 36 — The Map Before the Testing</w:t>
             </w:r>
           </w:p>
         </w:tc>
@@ -4696,27 +4965,25 @@
               <w:bottom w:val="single" w:color="D5DCE6" w:sz="4"/>
               <w:right w:val="single" w:color="D5DCE6" w:sz="4"/>
             </w:tcBorders>
-            <w:shd w:fill="F5F8FC" w:color="auto" w:val="clear"/>
-            <w:tcMar>
-              <w:top w:type="dxa" w:w="60"/>
-              <w:left w:type="dxa" w:w="100"/>
-              <w:bottom w:type="dxa" w:w="60"/>
-              <w:right w:type="dxa" w:w="100"/>
-            </w:tcMar>
-          </w:tcPr>
-          <w:p>
-            <w:pPr>
-              <w:spacing w:after="0" w:before="0" w:line="240"/>
-            </w:pPr>
-            <w:r>
-              <w:rPr>
-                <w:rFonts w:ascii="Calibri" w:cs="Calibri" w:eastAsia="Calibri" w:hAnsi="Calibri"/>
-                <w:b w:val="false"/>
-                <w:bCs w:val="false"/>
-                <w:sz w:val="18"/>
-                <w:szCs w:val="18"/>
-              </w:rPr>
-              <w:t xml:space="preserve"/>
+            <w:tcMar>
+              <w:top w:type="dxa" w:w="60"/>
+              <w:left w:type="dxa" w:w="100"/>
+              <w:bottom w:type="dxa" w:w="60"/>
+              <w:right w:type="dxa" w:w="100"/>
+            </w:tcMar>
+          </w:tcPr>
+          <w:p>
+            <w:pPr>
+              <w:spacing w:after="0" w:before="0" w:line="240"/>
+            </w:pPr>
+            <w:r>
+              <w:rPr>
+                <w:rFonts w:ascii="Calibri" w:cs="Calibri" w:eastAsia="Calibri" w:hAnsi="Calibri"/>
+                <w:b w:val="false"/>
+                <w:bCs w:val="false"/>
+                <w:sz w:val="18"/>
+                <w:szCs w:val="18"/>
+              </w:rPr>
             </w:r>
           </w:p>
         </w:tc>
@@ -4753,7 +5020,7 @@
                 <w:sz w:val="18"/>
                 <w:szCs w:val="18"/>
               </w:rPr>
-              <w:t xml:space="preserve">19</w:t>
+              <w:t>3</w:t>
             </w:r>
           </w:p>
         </w:tc>
@@ -4785,7 +5052,7 @@
                 <w:sz w:val="18"/>
                 <w:szCs w:val="18"/>
               </w:rPr>
-              <w:t xml:space="preserve">Wk 5 · Sat</w:t>
+              <w:t>Wk 1 · Sat</w:t>
             </w:r>
           </w:p>
         </w:tc>
@@ -4817,7 +5084,7 @@
                 <w:sz w:val="18"/>
                 <w:szCs w:val="18"/>
               </w:rPr>
-              <w:t xml:space="preserve">Rate the cohort's own findings from sessions 2–17</w:t>
+              <w:t>RCM workshop — finish the Thornfield RCM</w:t>
             </w:r>
           </w:p>
         </w:tc>
@@ -4849,7 +5116,7 @@
                 <w:sz w:val="18"/>
                 <w:szCs w:val="18"/>
               </w:rPr>
-              <w:t xml:space="preserve">Workpaper 3 returned marked</w:t>
+              <w:t>Thornfield RCM marked</w:t>
             </w:r>
           </w:p>
         </w:tc>
@@ -4867,27 +5134,26 @@
               <w:bottom w:val="single" w:color="D5DCE6" w:sz="4"/>
               <w:right w:val="single" w:color="D5DCE6" w:sz="4"/>
             </w:tcBorders>
-            <w:shd w:fill="F5F8FC" w:color="auto" w:val="clear"/>
-            <w:tcMar>
-              <w:top w:type="dxa" w:w="60"/>
-              <w:left w:type="dxa" w:w="100"/>
-              <w:bottom w:type="dxa" w:w="60"/>
-              <w:right w:type="dxa" w:w="100"/>
-            </w:tcMar>
-          </w:tcPr>
-          <w:p>
-            <w:pPr>
-              <w:spacing w:after="0" w:before="0" w:line="240"/>
-            </w:pPr>
-            <w:r>
-              <w:rPr>
-                <w:rFonts w:ascii="Calibri" w:cs="Calibri" w:eastAsia="Calibri" w:hAnsi="Calibri"/>
-                <w:b w:val="false"/>
-                <w:bCs w:val="false"/>
-                <w:sz w:val="18"/>
-                <w:szCs w:val="18"/>
-              </w:rPr>
-              <w:t xml:space="preserve">20</w:t>
+            <w:tcMar>
+              <w:top w:type="dxa" w:w="60"/>
+              <w:left w:type="dxa" w:w="100"/>
+              <w:bottom w:type="dxa" w:w="60"/>
+              <w:right w:type="dxa" w:w="100"/>
+            </w:tcMar>
+          </w:tcPr>
+          <w:p>
+            <w:pPr>
+              <w:spacing w:after="0" w:before="0" w:line="240"/>
+            </w:pPr>
+            <w:r>
+              <w:rPr>
+                <w:rFonts w:ascii="Calibri" w:cs="Calibri" w:eastAsia="Calibri" w:hAnsi="Calibri"/>
+                <w:b w:val="false"/>
+                <w:bCs w:val="false"/>
+                <w:sz w:val="18"/>
+                <w:szCs w:val="18"/>
+              </w:rPr>
+              <w:t>4</w:t>
             </w:r>
           </w:p>
         </w:tc>
@@ -4900,27 +5166,26 @@
               <w:bottom w:val="single" w:color="D5DCE6" w:sz="4"/>
               <w:right w:val="single" w:color="D5DCE6" w:sz="4"/>
             </w:tcBorders>
-            <w:shd w:fill="F5F8FC" w:color="auto" w:val="clear"/>
-            <w:tcMar>
-              <w:top w:type="dxa" w:w="60"/>
-              <w:left w:type="dxa" w:w="100"/>
-              <w:bottom w:type="dxa" w:w="60"/>
-              <w:right w:type="dxa" w:w="100"/>
-            </w:tcMar>
-          </w:tcPr>
-          <w:p>
-            <w:pPr>
-              <w:spacing w:after="0" w:before="0" w:line="240"/>
-            </w:pPr>
-            <w:r>
-              <w:rPr>
-                <w:rFonts w:ascii="Calibri" w:cs="Calibri" w:eastAsia="Calibri" w:hAnsi="Calibri"/>
-                <w:b w:val="false"/>
-                <w:bCs w:val="false"/>
-                <w:sz w:val="18"/>
-                <w:szCs w:val="18"/>
-              </w:rPr>
-              <w:t xml:space="preserve">Wk 5 · Sun</w:t>
+            <w:tcMar>
+              <w:top w:type="dxa" w:w="60"/>
+              <w:left w:type="dxa" w:w="100"/>
+              <w:bottom w:type="dxa" w:w="60"/>
+              <w:right w:type="dxa" w:w="100"/>
+            </w:tcMar>
+          </w:tcPr>
+          <w:p>
+            <w:pPr>
+              <w:spacing w:after="0" w:before="0" w:line="240"/>
+            </w:pPr>
+            <w:r>
+              <w:rPr>
+                <w:rFonts w:ascii="Calibri" w:cs="Calibri" w:eastAsia="Calibri" w:hAnsi="Calibri"/>
+                <w:b w:val="false"/>
+                <w:bCs w:val="false"/>
+                <w:sz w:val="18"/>
+                <w:szCs w:val="18"/>
+              </w:rPr>
+              <w:t>Wk 1 · Sun</w:t>
             </w:r>
           </w:p>
         </w:tc>
@@ -4933,27 +5198,26 @@
               <w:bottom w:val="single" w:color="D5DCE6" w:sz="4"/>
               <w:right w:val="single" w:color="D5DCE6" w:sz="4"/>
             </w:tcBorders>
-            <w:shd w:fill="F5F8FC" w:color="auto" w:val="clear"/>
-            <w:tcMar>
-              <w:top w:type="dxa" w:w="60"/>
-              <w:left w:type="dxa" w:w="100"/>
-              <w:bottom w:type="dxa" w:w="60"/>
-              <w:right w:type="dxa" w:w="100"/>
-            </w:tcMar>
-          </w:tcPr>
-          <w:p>
-            <w:pPr>
-              <w:spacing w:after="0" w:before="0" w:line="240"/>
-            </w:pPr>
-            <w:r>
-              <w:rPr>
-                <w:rFonts w:ascii="Calibri" w:cs="Calibri" w:eastAsia="Calibri" w:hAnsi="Calibri"/>
-                <w:b w:val="false"/>
-                <w:bCs w:val="false"/>
-                <w:sz w:val="18"/>
-                <w:szCs w:val="18"/>
-              </w:rPr>
-              <w:t xml:space="preserve">Stakeholder panel + Part X tools &amp; AI awareness + close</w:t>
+            <w:tcMar>
+              <w:top w:type="dxa" w:w="60"/>
+              <w:left w:type="dxa" w:w="100"/>
+              <w:bottom w:type="dxa" w:w="60"/>
+              <w:right w:type="dxa" w:w="100"/>
+            </w:tcMar>
+          </w:tcPr>
+          <w:p>
+            <w:pPr>
+              <w:spacing w:after="0" w:before="0" w:line="240"/>
+            </w:pPr>
+            <w:r>
+              <w:rPr>
+                <w:rFonts w:ascii="Calibri" w:cs="Calibri" w:eastAsia="Calibri" w:hAnsi="Calibri"/>
+                <w:b w:val="false"/>
+                <w:bCs w:val="false"/>
+                <w:sz w:val="18"/>
+                <w:szCs w:val="18"/>
+              </w:rPr>
+              <w:t>Book 37 — The Control That Was Never Built to Hold</w:t>
             </w:r>
           </w:p>
         </w:tc>
@@ -4966,27 +5230,1084 @@
               <w:bottom w:val="single" w:color="D5DCE6" w:sz="4"/>
               <w:right w:val="single" w:color="D5DCE6" w:sz="4"/>
             </w:tcBorders>
-            <w:shd w:fill="F5F8FC" w:color="auto" w:val="clear"/>
-            <w:tcMar>
-              <w:top w:type="dxa" w:w="60"/>
-              <w:left w:type="dxa" w:w="100"/>
-              <w:bottom w:type="dxa" w:w="60"/>
-              <w:right w:type="dxa" w:w="100"/>
-            </w:tcMar>
-          </w:tcPr>
-          <w:p>
-            <w:pPr>
-              <w:spacing w:after="0" w:before="0" w:line="240"/>
-            </w:pPr>
-            <w:r>
-              <w:rPr>
-                <w:rFonts w:ascii="Calibri" w:cs="Calibri" w:eastAsia="Calibri" w:hAnsi="Calibri"/>
-                <w:b w:val="false"/>
-                <w:bCs w:val="false"/>
-                <w:sz w:val="18"/>
-                <w:szCs w:val="18"/>
-              </w:rPr>
-              <w:t xml:space="preserve">Stakeholder panel graded · certificate eligibility confirmed</w:t>
+            <w:tcMar>
+              <w:top w:type="dxa" w:w="60"/>
+              <w:left w:type="dxa" w:w="100"/>
+              <w:bottom w:type="dxa" w:w="60"/>
+              <w:right w:type="dxa" w:w="100"/>
+            </w:tcMar>
+          </w:tcPr>
+          <w:p>
+            <w:pPr>
+              <w:spacing w:after="0" w:before="0" w:line="240"/>
+            </w:pPr>
+            <w:r>
+              <w:rPr>
+                <w:rFonts w:ascii="Calibri" w:cs="Calibri" w:eastAsia="Calibri" w:hAnsi="Calibri"/>
+                <w:b w:val="false"/>
+                <w:bCs w:val="false"/>
+                <w:sz w:val="18"/>
+                <w:szCs w:val="18"/>
+              </w:rPr>
+            </w:r>
+          </w:p>
+        </w:tc>
+      </w:tr>
+      <w:tr>
+        <w:trPr>
+          <w:cantSplit/>
+        </w:trPr>
+        <w:tc>
+          <w:tcPr>
+            <w:tcW w:type="dxa" w:w="700"/>
+            <w:tcBorders>
+              <w:top w:val="single" w:color="D5DCE6" w:sz="4"/>
+              <w:left w:val="single" w:color="D5DCE6" w:sz="4"/>
+              <w:bottom w:val="single" w:color="D5DCE6" w:sz="4"/>
+              <w:right w:val="single" w:color="D5DCE6" w:sz="4"/>
+            </w:tcBorders>
+            <w:tcMar>
+              <w:top w:type="dxa" w:w="60"/>
+              <w:left w:type="dxa" w:w="100"/>
+              <w:bottom w:type="dxa" w:w="60"/>
+              <w:right w:type="dxa" w:w="100"/>
+            </w:tcMar>
+          </w:tcPr>
+          <w:p>
+            <w:pPr>
+              <w:spacing w:after="0" w:before="0" w:line="240"/>
+            </w:pPr>
+            <w:r>
+              <w:rPr>
+                <w:rFonts w:ascii="Calibri" w:cs="Calibri" w:eastAsia="Calibri" w:hAnsi="Calibri"/>
+                <w:b w:val="false"/>
+                <w:bCs w:val="false"/>
+                <w:sz w:val="18"/>
+                <w:szCs w:val="18"/>
+              </w:rPr>
+              <w:t>5</w:t>
+            </w:r>
+          </w:p>
+        </w:tc>
+        <w:tc>
+          <w:tcPr>
+            <w:tcW w:type="dxa" w:w="1100"/>
+            <w:tcBorders>
+              <w:top w:val="single" w:color="D5DCE6" w:sz="4"/>
+              <w:left w:val="single" w:color="D5DCE6" w:sz="4"/>
+              <w:bottom w:val="single" w:color="D5DCE6" w:sz="4"/>
+              <w:right w:val="single" w:color="D5DCE6" w:sz="4"/>
+            </w:tcBorders>
+            <w:tcMar>
+              <w:top w:type="dxa" w:w="60"/>
+              <w:left w:type="dxa" w:w="100"/>
+              <w:bottom w:type="dxa" w:w="60"/>
+              <w:right w:type="dxa" w:w="100"/>
+            </w:tcMar>
+          </w:tcPr>
+          <w:p>
+            <w:pPr>
+              <w:spacing w:after="0" w:before="0" w:line="240"/>
+            </w:pPr>
+            <w:r>
+              <w:rPr>
+                <w:rFonts w:ascii="Calibri" w:cs="Calibri" w:eastAsia="Calibri" w:hAnsi="Calibri"/>
+                <w:b w:val="false"/>
+                <w:bCs w:val="false"/>
+                <w:sz w:val="18"/>
+                <w:szCs w:val="18"/>
+              </w:rPr>
+              <w:t>Wk 2 · Tue</w:t>
+            </w:r>
+          </w:p>
+        </w:tc>
+        <w:tc>
+          <w:tcPr>
+            <w:tcW w:type="dxa" w:w="5300"/>
+            <w:tcBorders>
+              <w:top w:val="single" w:color="D5DCE6" w:sz="4"/>
+              <w:left w:val="single" w:color="D5DCE6" w:sz="4"/>
+              <w:bottom w:val="single" w:color="D5DCE6" w:sz="4"/>
+              <w:right w:val="single" w:color="D5DCE6" w:sz="4"/>
+            </w:tcBorders>
+            <w:tcMar>
+              <w:top w:type="dxa" w:w="60"/>
+              <w:left w:type="dxa" w:w="100"/>
+              <w:bottom w:type="dxa" w:w="60"/>
+              <w:right w:type="dxa" w:w="100"/>
+            </w:tcMar>
+          </w:tcPr>
+          <w:p>
+            <w:pPr>
+              <w:spacing w:after="0" w:before="0" w:line="240"/>
+            </w:pPr>
+            <w:r>
+              <w:rPr>
+                <w:rFonts w:ascii="Calibri" w:cs="Calibri" w:eastAsia="Calibri" w:hAnsi="Calibri"/>
+                <w:b w:val="false"/>
+                <w:bCs w:val="false"/>
+                <w:sz w:val="18"/>
+                <w:szCs w:val="18"/>
+              </w:rPr>
+              <w:t>Book 38 — How Many Is Enough</w:t>
+            </w:r>
+          </w:p>
+        </w:tc>
+        <w:tc>
+          <w:tcPr>
+            <w:tcW w:type="dxa" w:w="2980"/>
+            <w:tcBorders>
+              <w:top w:val="single" w:color="D5DCE6" w:sz="4"/>
+              <w:left w:val="single" w:color="D5DCE6" w:sz="4"/>
+              <w:bottom w:val="single" w:color="D5DCE6" w:sz="4"/>
+              <w:right w:val="single" w:color="D5DCE6" w:sz="4"/>
+            </w:tcBorders>
+            <w:tcMar>
+              <w:top w:type="dxa" w:w="60"/>
+              <w:left w:type="dxa" w:w="100"/>
+              <w:bottom w:type="dxa" w:w="60"/>
+              <w:right w:type="dxa" w:w="100"/>
+            </w:tcMar>
+          </w:tcPr>
+          <w:p>
+            <w:pPr>
+              <w:spacing w:after="0" w:before="0" w:line="240"/>
+            </w:pPr>
+            <w:r>
+              <w:rPr>
+                <w:rFonts w:ascii="Calibri" w:cs="Calibri" w:eastAsia="Calibri" w:hAnsi="Calibri"/>
+                <w:b w:val="false"/>
+                <w:bCs w:val="false"/>
+                <w:sz w:val="18"/>
+                <w:szCs w:val="18"/>
+              </w:rPr>
+            </w:r>
+          </w:p>
+        </w:tc>
+      </w:tr>
+      <w:tr>
+        <w:trPr>
+          <w:cantSplit/>
+        </w:trPr>
+        <w:tc>
+          <w:tcPr>
+            <w:tcW w:type="dxa" w:w="700"/>
+            <w:tcBorders>
+              <w:top w:val="single" w:color="D5DCE6" w:sz="4"/>
+              <w:left w:val="single" w:color="D5DCE6" w:sz="4"/>
+              <w:bottom w:val="single" w:color="D5DCE6" w:sz="4"/>
+              <w:right w:val="single" w:color="D5DCE6" w:sz="4"/>
+            </w:tcBorders>
+            <w:tcMar>
+              <w:top w:type="dxa" w:w="60"/>
+              <w:left w:type="dxa" w:w="100"/>
+              <w:bottom w:type="dxa" w:w="60"/>
+              <w:right w:type="dxa" w:w="100"/>
+            </w:tcMar>
+          </w:tcPr>
+          <w:p>
+            <w:pPr>
+              <w:spacing w:after="0" w:before="0" w:line="240"/>
+            </w:pPr>
+            <w:r>
+              <w:rPr>
+                <w:rFonts w:ascii="Calibri" w:cs="Calibri" w:eastAsia="Calibri" w:hAnsi="Calibri"/>
+                <w:b w:val="false"/>
+                <w:bCs w:val="false"/>
+                <w:sz w:val="18"/>
+                <w:szCs w:val="18"/>
+              </w:rPr>
+              <w:t>6</w:t>
+            </w:r>
+          </w:p>
+        </w:tc>
+        <w:tc>
+          <w:tcPr>
+            <w:tcW w:type="dxa" w:w="1100"/>
+            <w:tcBorders>
+              <w:top w:val="single" w:color="D5DCE6" w:sz="4"/>
+              <w:left w:val="single" w:color="D5DCE6" w:sz="4"/>
+              <w:bottom w:val="single" w:color="D5DCE6" w:sz="4"/>
+              <w:right w:val="single" w:color="D5DCE6" w:sz="4"/>
+            </w:tcBorders>
+            <w:tcMar>
+              <w:top w:type="dxa" w:w="60"/>
+              <w:left w:type="dxa" w:w="100"/>
+              <w:bottom w:type="dxa" w:w="60"/>
+              <w:right w:type="dxa" w:w="100"/>
+            </w:tcMar>
+          </w:tcPr>
+          <w:p>
+            <w:pPr>
+              <w:spacing w:after="0" w:before="0" w:line="240"/>
+            </w:pPr>
+            <w:r>
+              <w:rPr>
+                <w:rFonts w:ascii="Calibri" w:cs="Calibri" w:eastAsia="Calibri" w:hAnsi="Calibri"/>
+                <w:b w:val="false"/>
+                <w:bCs w:val="false"/>
+                <w:sz w:val="18"/>
+                <w:szCs w:val="18"/>
+              </w:rPr>
+              <w:t>Wk 2 · Thu</w:t>
+            </w:r>
+          </w:p>
+        </w:tc>
+        <w:tc>
+          <w:tcPr>
+            <w:tcW w:type="dxa" w:w="5300"/>
+            <w:tcBorders>
+              <w:top w:val="single" w:color="D5DCE6" w:sz="4"/>
+              <w:left w:val="single" w:color="D5DCE6" w:sz="4"/>
+              <w:bottom w:val="single" w:color="D5DCE6" w:sz="4"/>
+              <w:right w:val="single" w:color="D5DCE6" w:sz="4"/>
+            </w:tcBorders>
+            <w:tcMar>
+              <w:top w:type="dxa" w:w="60"/>
+              <w:left w:type="dxa" w:w="100"/>
+              <w:bottom w:type="dxa" w:w="60"/>
+              <w:right w:type="dxa" w:w="100"/>
+            </w:tcMar>
+          </w:tcPr>
+          <w:p>
+            <w:pPr>
+              <w:spacing w:after="0" w:before="0" w:line="240"/>
+            </w:pPr>
+            <w:r>
+              <w:rPr>
+                <w:rFonts w:ascii="Calibri" w:cs="Calibri" w:eastAsia="Calibri" w:hAnsi="Calibri"/>
+                <w:b w:val="false"/>
+                <w:bCs w:val="false"/>
+                <w:sz w:val="18"/>
+                <w:szCs w:val="18"/>
+              </w:rPr>
+              <w:t>Book 39 — What Kind of Finding Is This</w:t>
+            </w:r>
+          </w:p>
+        </w:tc>
+        <w:tc>
+          <w:tcPr>
+            <w:tcW w:type="dxa" w:w="2980"/>
+            <w:tcBorders>
+              <w:top w:val="single" w:color="D5DCE6" w:sz="4"/>
+              <w:left w:val="single" w:color="D5DCE6" w:sz="4"/>
+              <w:bottom w:val="single" w:color="D5DCE6" w:sz="4"/>
+              <w:right w:val="single" w:color="D5DCE6" w:sz="4"/>
+            </w:tcBorders>
+            <w:tcMar>
+              <w:top w:type="dxa" w:w="60"/>
+              <w:left w:type="dxa" w:w="100"/>
+              <w:bottom w:type="dxa" w:w="60"/>
+              <w:right w:type="dxa" w:w="100"/>
+            </w:tcMar>
+          </w:tcPr>
+          <w:p>
+            <w:pPr>
+              <w:spacing w:after="0" w:before="0" w:line="240"/>
+            </w:pPr>
+            <w:r>
+              <w:rPr>
+                <w:rFonts w:ascii="Calibri" w:cs="Calibri" w:eastAsia="Calibri" w:hAnsi="Calibri"/>
+                <w:b w:val="false"/>
+                <w:bCs w:val="false"/>
+                <w:sz w:val="18"/>
+                <w:szCs w:val="18"/>
+              </w:rPr>
+              <w:t>Deficiency memo assigned — due before session 11</w:t>
+            </w:r>
+          </w:p>
+        </w:tc>
+      </w:tr>
+      <w:tr>
+        <w:trPr>
+          <w:cantSplit/>
+        </w:trPr>
+        <w:tc>
+          <w:tcPr>
+            <w:tcW w:type="dxa" w:w="700"/>
+            <w:tcBorders>
+              <w:top w:val="single" w:color="D5DCE6" w:sz="4"/>
+              <w:left w:val="single" w:color="D5DCE6" w:sz="4"/>
+              <w:bottom w:val="single" w:color="D5DCE6" w:sz="4"/>
+              <w:right w:val="single" w:color="D5DCE6" w:sz="4"/>
+            </w:tcBorders>
+            <w:tcMar>
+              <w:top w:type="dxa" w:w="60"/>
+              <w:left w:type="dxa" w:w="100"/>
+              <w:bottom w:type="dxa" w:w="60"/>
+              <w:right w:type="dxa" w:w="100"/>
+            </w:tcMar>
+          </w:tcPr>
+          <w:p>
+            <w:pPr>
+              <w:spacing w:after="0" w:before="0" w:line="240"/>
+            </w:pPr>
+            <w:r>
+              <w:rPr>
+                <w:rFonts w:ascii="Calibri" w:cs="Calibri" w:eastAsia="Calibri" w:hAnsi="Calibri"/>
+                <w:b w:val="false"/>
+                <w:bCs w:val="false"/>
+                <w:sz w:val="18"/>
+                <w:szCs w:val="18"/>
+              </w:rPr>
+              <w:t>7</w:t>
+            </w:r>
+          </w:p>
+        </w:tc>
+        <w:tc>
+          <w:tcPr>
+            <w:tcW w:type="dxa" w:w="1100"/>
+            <w:tcBorders>
+              <w:top w:val="single" w:color="D5DCE6" w:sz="4"/>
+              <w:left w:val="single" w:color="D5DCE6" w:sz="4"/>
+              <w:bottom w:val="single" w:color="D5DCE6" w:sz="4"/>
+              <w:right w:val="single" w:color="D5DCE6" w:sz="4"/>
+            </w:tcBorders>
+            <w:tcMar>
+              <w:top w:type="dxa" w:w="60"/>
+              <w:left w:type="dxa" w:w="100"/>
+              <w:bottom w:type="dxa" w:w="60"/>
+              <w:right w:type="dxa" w:w="100"/>
+            </w:tcMar>
+          </w:tcPr>
+          <w:p>
+            <w:pPr>
+              <w:spacing w:after="0" w:before="0" w:line="240"/>
+            </w:pPr>
+            <w:r>
+              <w:rPr>
+                <w:rFonts w:ascii="Calibri" w:cs="Calibri" w:eastAsia="Calibri" w:hAnsi="Calibri"/>
+                <w:b w:val="false"/>
+                <w:bCs w:val="false"/>
+                <w:sz w:val="18"/>
+                <w:szCs w:val="18"/>
+              </w:rPr>
+              <w:t>Wk 2 · Sat</w:t>
+            </w:r>
+          </w:p>
+        </w:tc>
+        <w:tc>
+          <w:tcPr>
+            <w:tcW w:type="dxa" w:w="5300"/>
+            <w:tcBorders>
+              <w:top w:val="single" w:color="D5DCE6" w:sz="4"/>
+              <w:left w:val="single" w:color="D5DCE6" w:sz="4"/>
+              <w:bottom w:val="single" w:color="D5DCE6" w:sz="4"/>
+              <w:right w:val="single" w:color="D5DCE6" w:sz="4"/>
+            </w:tcBorders>
+            <w:tcMar>
+              <w:top w:type="dxa" w:w="60"/>
+              <w:left w:type="dxa" w:w="100"/>
+              <w:bottom w:type="dxa" w:w="60"/>
+              <w:right w:type="dxa" w:w="100"/>
+            </w:tcMar>
+          </w:tcPr>
+          <w:p>
+            <w:pPr>
+              <w:spacing w:after="0" w:before="0" w:line="240"/>
+            </w:pPr>
+            <w:r>
+              <w:rPr>
+                <w:rFonts w:ascii="Calibri" w:cs="Calibri" w:eastAsia="Calibri" w:hAnsi="Calibri"/>
+                <w:b w:val="false"/>
+                <w:bCs w:val="false"/>
+                <w:sz w:val="18"/>
+                <w:szCs w:val="18"/>
+              </w:rPr>
+              <w:t>Book 33 — The Other Platform</w:t>
+            </w:r>
+          </w:p>
+        </w:tc>
+        <w:tc>
+          <w:tcPr>
+            <w:tcW w:type="dxa" w:w="2980"/>
+            <w:tcBorders>
+              <w:top w:val="single" w:color="D5DCE6" w:sz="4"/>
+              <w:left w:val="single" w:color="D5DCE6" w:sz="4"/>
+              <w:bottom w:val="single" w:color="D5DCE6" w:sz="4"/>
+              <w:right w:val="single" w:color="D5DCE6" w:sz="4"/>
+            </w:tcBorders>
+            <w:tcMar>
+              <w:top w:type="dxa" w:w="60"/>
+              <w:left w:type="dxa" w:w="100"/>
+              <w:bottom w:type="dxa" w:w="60"/>
+              <w:right w:type="dxa" w:w="100"/>
+            </w:tcMar>
+          </w:tcPr>
+          <w:p>
+            <w:pPr>
+              <w:spacing w:after="0" w:before="0" w:line="240"/>
+            </w:pPr>
+            <w:r>
+              <w:rPr>
+                <w:rFonts w:ascii="Calibri" w:cs="Calibri" w:eastAsia="Calibri" w:hAnsi="Calibri"/>
+                <w:b w:val="false"/>
+                <w:bCs w:val="false"/>
+                <w:sz w:val="18"/>
+                <w:szCs w:val="18"/>
+              </w:rPr>
+            </w:r>
+          </w:p>
+        </w:tc>
+      </w:tr>
+      <w:tr>
+        <w:trPr>
+          <w:cantSplit/>
+        </w:trPr>
+        <w:tc>
+          <w:tcPr>
+            <w:tcW w:type="dxa" w:w="700"/>
+            <w:tcBorders>
+              <w:top w:val="single" w:color="D5DCE6" w:sz="4"/>
+              <w:left w:val="single" w:color="D5DCE6" w:sz="4"/>
+              <w:bottom w:val="single" w:color="D5DCE6" w:sz="4"/>
+              <w:right w:val="single" w:color="D5DCE6" w:sz="4"/>
+            </w:tcBorders>
+            <w:tcMar>
+              <w:top w:type="dxa" w:w="60"/>
+              <w:left w:type="dxa" w:w="100"/>
+              <w:bottom w:type="dxa" w:w="60"/>
+              <w:right w:type="dxa" w:w="100"/>
+            </w:tcMar>
+          </w:tcPr>
+          <w:p>
+            <w:pPr>
+              <w:spacing w:after="0" w:before="0" w:line="240"/>
+            </w:pPr>
+            <w:r>
+              <w:rPr>
+                <w:rFonts w:ascii="Calibri" w:cs="Calibri" w:eastAsia="Calibri" w:hAnsi="Calibri"/>
+                <w:b w:val="false"/>
+                <w:bCs w:val="false"/>
+                <w:sz w:val="18"/>
+                <w:szCs w:val="18"/>
+              </w:rPr>
+              <w:t>8</w:t>
+            </w:r>
+          </w:p>
+        </w:tc>
+        <w:tc>
+          <w:tcPr>
+            <w:tcW w:type="dxa" w:w="1100"/>
+            <w:tcBorders>
+              <w:top w:val="single" w:color="D5DCE6" w:sz="4"/>
+              <w:left w:val="single" w:color="D5DCE6" w:sz="4"/>
+              <w:bottom w:val="single" w:color="D5DCE6" w:sz="4"/>
+              <w:right w:val="single" w:color="D5DCE6" w:sz="4"/>
+            </w:tcBorders>
+            <w:tcMar>
+              <w:top w:type="dxa" w:w="60"/>
+              <w:left w:type="dxa" w:w="100"/>
+              <w:bottom w:type="dxa" w:w="60"/>
+              <w:right w:type="dxa" w:w="100"/>
+            </w:tcMar>
+          </w:tcPr>
+          <w:p>
+            <w:pPr>
+              <w:spacing w:after="0" w:before="0" w:line="240"/>
+            </w:pPr>
+            <w:r>
+              <w:rPr>
+                <w:rFonts w:ascii="Calibri" w:cs="Calibri" w:eastAsia="Calibri" w:hAnsi="Calibri"/>
+                <w:b w:val="false"/>
+                <w:bCs w:val="false"/>
+                <w:sz w:val="18"/>
+                <w:szCs w:val="18"/>
+              </w:rPr>
+              <w:t>Wk 2 · Sun</w:t>
+            </w:r>
+          </w:p>
+        </w:tc>
+        <w:tc>
+          <w:tcPr>
+            <w:tcW w:type="dxa" w:w="5300"/>
+            <w:tcBorders>
+              <w:top w:val="single" w:color="D5DCE6" w:sz="4"/>
+              <w:left w:val="single" w:color="D5DCE6" w:sz="4"/>
+              <w:bottom w:val="single" w:color="D5DCE6" w:sz="4"/>
+              <w:right w:val="single" w:color="D5DCE6" w:sz="4"/>
+            </w:tcBorders>
+            <w:tcMar>
+              <w:top w:type="dxa" w:w="60"/>
+              <w:left w:type="dxa" w:w="100"/>
+              <w:bottom w:type="dxa" w:w="60"/>
+              <w:right w:type="dxa" w:w="100"/>
+            </w:tcMar>
+          </w:tcPr>
+          <w:p>
+            <w:pPr>
+              <w:spacing w:after="0" w:before="0" w:line="240"/>
+            </w:pPr>
+            <w:r>
+              <w:rPr>
+                <w:rFonts w:ascii="Calibri" w:cs="Calibri" w:eastAsia="Calibri" w:hAnsi="Calibri"/>
+                <w:b w:val="false"/>
+                <w:bCs w:val="false"/>
+                <w:sz w:val="18"/>
+                <w:szCs w:val="18"/>
+              </w:rPr>
+              <w:t>Book 34 — The Spreadsheet That Found It</w:t>
+            </w:r>
+          </w:p>
+        </w:tc>
+        <w:tc>
+          <w:tcPr>
+            <w:tcW w:type="dxa" w:w="2980"/>
+            <w:tcBorders>
+              <w:top w:val="single" w:color="D5DCE6" w:sz="4"/>
+              <w:left w:val="single" w:color="D5DCE6" w:sz="4"/>
+              <w:bottom w:val="single" w:color="D5DCE6" w:sz="4"/>
+              <w:right w:val="single" w:color="D5DCE6" w:sz="4"/>
+            </w:tcBorders>
+            <w:tcMar>
+              <w:top w:type="dxa" w:w="60"/>
+              <w:left w:type="dxa" w:w="100"/>
+              <w:bottom w:type="dxa" w:w="60"/>
+              <w:right w:type="dxa" w:w="100"/>
+            </w:tcMar>
+          </w:tcPr>
+          <w:p>
+            <w:pPr>
+              <w:spacing w:after="0" w:before="0" w:line="240"/>
+            </w:pPr>
+            <w:r>
+              <w:rPr>
+                <w:rFonts w:ascii="Calibri" w:cs="Calibri" w:eastAsia="Calibri" w:hAnsi="Calibri"/>
+                <w:b w:val="false"/>
+                <w:bCs w:val="false"/>
+                <w:sz w:val="18"/>
+                <w:szCs w:val="18"/>
+              </w:rPr>
+            </w:r>
+          </w:p>
+        </w:tc>
+      </w:tr>
+      <w:tr>
+        <w:trPr>
+          <w:cantSplit/>
+        </w:trPr>
+        <w:tc>
+          <w:tcPr>
+            <w:tcW w:type="dxa" w:w="700"/>
+            <w:tcBorders>
+              <w:top w:val="single" w:color="D5DCE6" w:sz="4"/>
+              <w:left w:val="single" w:color="D5DCE6" w:sz="4"/>
+              <w:bottom w:val="single" w:color="D5DCE6" w:sz="4"/>
+              <w:right w:val="single" w:color="D5DCE6" w:sz="4"/>
+            </w:tcBorders>
+            <w:tcMar>
+              <w:top w:type="dxa" w:w="60"/>
+              <w:left w:type="dxa" w:w="100"/>
+              <w:bottom w:type="dxa" w:w="60"/>
+              <w:right w:type="dxa" w:w="100"/>
+            </w:tcMar>
+          </w:tcPr>
+          <w:p>
+            <w:pPr>
+              <w:spacing w:after="0" w:before="0" w:line="240"/>
+            </w:pPr>
+            <w:r>
+              <w:rPr>
+                <w:rFonts w:ascii="Calibri" w:cs="Calibri" w:eastAsia="Calibri" w:hAnsi="Calibri"/>
+                <w:b w:val="false"/>
+                <w:bCs w:val="false"/>
+                <w:sz w:val="18"/>
+                <w:szCs w:val="18"/>
+              </w:rPr>
+              <w:t>9</w:t>
+            </w:r>
+          </w:p>
+        </w:tc>
+        <w:tc>
+          <w:tcPr>
+            <w:tcW w:type="dxa" w:w="1100"/>
+            <w:tcBorders>
+              <w:top w:val="single" w:color="D5DCE6" w:sz="4"/>
+              <w:left w:val="single" w:color="D5DCE6" w:sz="4"/>
+              <w:bottom w:val="single" w:color="D5DCE6" w:sz="4"/>
+              <w:right w:val="single" w:color="D5DCE6" w:sz="4"/>
+            </w:tcBorders>
+            <w:tcMar>
+              <w:top w:type="dxa" w:w="60"/>
+              <w:left w:type="dxa" w:w="100"/>
+              <w:bottom w:type="dxa" w:w="60"/>
+              <w:right w:type="dxa" w:w="100"/>
+            </w:tcMar>
+          </w:tcPr>
+          <w:p>
+            <w:pPr>
+              <w:spacing w:after="0" w:before="0" w:line="240"/>
+            </w:pPr>
+            <w:r>
+              <w:rPr>
+                <w:rFonts w:ascii="Calibri" w:cs="Calibri" w:eastAsia="Calibri" w:hAnsi="Calibri"/>
+                <w:b w:val="false"/>
+                <w:bCs w:val="false"/>
+                <w:sz w:val="18"/>
+                <w:szCs w:val="18"/>
+              </w:rPr>
+              <w:t>Wk 3 · Tue</w:t>
+            </w:r>
+          </w:p>
+        </w:tc>
+        <w:tc>
+          <w:tcPr>
+            <w:tcW w:type="dxa" w:w="5300"/>
+            <w:tcBorders>
+              <w:top w:val="single" w:color="D5DCE6" w:sz="4"/>
+              <w:left w:val="single" w:color="D5DCE6" w:sz="4"/>
+              <w:bottom w:val="single" w:color="D5DCE6" w:sz="4"/>
+              <w:right w:val="single" w:color="D5DCE6" w:sz="4"/>
+            </w:tcBorders>
+            <w:tcMar>
+              <w:top w:type="dxa" w:w="60"/>
+              <w:left w:type="dxa" w:w="100"/>
+              <w:bottom w:type="dxa" w:w="60"/>
+              <w:right w:type="dxa" w:w="100"/>
+            </w:tcMar>
+          </w:tcPr>
+          <w:p>
+            <w:pPr>
+              <w:spacing w:after="0" w:before="0" w:line="240"/>
+            </w:pPr>
+            <w:r>
+              <w:rPr>
+                <w:rFonts w:ascii="Calibri" w:cs="Calibri" w:eastAsia="Calibri" w:hAnsi="Calibri"/>
+                <w:b w:val="false"/>
+                <w:bCs w:val="false"/>
+                <w:sz w:val="18"/>
+                <w:szCs w:val="18"/>
+              </w:rPr>
+              <w:t>Book 35 — The Recommendation Nobody Checked</w:t>
+            </w:r>
+          </w:p>
+        </w:tc>
+        <w:tc>
+          <w:tcPr>
+            <w:tcW w:type="dxa" w:w="2980"/>
+            <w:tcBorders>
+              <w:top w:val="single" w:color="D5DCE6" w:sz="4"/>
+              <w:left w:val="single" w:color="D5DCE6" w:sz="4"/>
+              <w:bottom w:val="single" w:color="D5DCE6" w:sz="4"/>
+              <w:right w:val="single" w:color="D5DCE6" w:sz="4"/>
+            </w:tcBorders>
+            <w:tcMar>
+              <w:top w:type="dxa" w:w="60"/>
+              <w:left w:type="dxa" w:w="100"/>
+              <w:bottom w:type="dxa" w:w="60"/>
+              <w:right w:type="dxa" w:w="100"/>
+            </w:tcMar>
+          </w:tcPr>
+          <w:p>
+            <w:pPr>
+              <w:spacing w:after="0" w:before="0" w:line="240"/>
+            </w:pPr>
+            <w:r>
+              <w:rPr>
+                <w:rFonts w:ascii="Calibri" w:cs="Calibri" w:eastAsia="Calibri" w:hAnsi="Calibri"/>
+                <w:b w:val="false"/>
+                <w:bCs w:val="false"/>
+                <w:sz w:val="18"/>
+                <w:szCs w:val="18"/>
+              </w:rPr>
+            </w:r>
+          </w:p>
+        </w:tc>
+      </w:tr>
+      <w:tr>
+        <w:trPr>
+          <w:cantSplit/>
+        </w:trPr>
+        <w:tc>
+          <w:tcPr>
+            <w:tcW w:type="dxa" w:w="700"/>
+            <w:tcBorders>
+              <w:top w:val="single" w:color="D5DCE6" w:sz="4"/>
+              <w:left w:val="single" w:color="D5DCE6" w:sz="4"/>
+              <w:bottom w:val="single" w:color="D5DCE6" w:sz="4"/>
+              <w:right w:val="single" w:color="D5DCE6" w:sz="4"/>
+            </w:tcBorders>
+            <w:tcMar>
+              <w:top w:type="dxa" w:w="60"/>
+              <w:left w:type="dxa" w:w="100"/>
+              <w:bottom w:type="dxa" w:w="60"/>
+              <w:right w:type="dxa" w:w="100"/>
+            </w:tcMar>
+          </w:tcPr>
+          <w:p>
+            <w:pPr>
+              <w:spacing w:after="0" w:before="0" w:line="240"/>
+            </w:pPr>
+            <w:r>
+              <w:rPr>
+                <w:rFonts w:ascii="Calibri" w:cs="Calibri" w:eastAsia="Calibri" w:hAnsi="Calibri"/>
+                <w:b w:val="false"/>
+                <w:bCs w:val="false"/>
+                <w:sz w:val="18"/>
+                <w:szCs w:val="18"/>
+              </w:rPr>
+              <w:t>10</w:t>
+            </w:r>
+          </w:p>
+        </w:tc>
+        <w:tc>
+          <w:tcPr>
+            <w:tcW w:type="dxa" w:w="1100"/>
+            <w:tcBorders>
+              <w:top w:val="single" w:color="D5DCE6" w:sz="4"/>
+              <w:left w:val="single" w:color="D5DCE6" w:sz="4"/>
+              <w:bottom w:val="single" w:color="D5DCE6" w:sz="4"/>
+              <w:right w:val="single" w:color="D5DCE6" w:sz="4"/>
+            </w:tcBorders>
+            <w:tcMar>
+              <w:top w:type="dxa" w:w="60"/>
+              <w:left w:type="dxa" w:w="100"/>
+              <w:bottom w:type="dxa" w:w="60"/>
+              <w:right w:type="dxa" w:w="100"/>
+            </w:tcMar>
+          </w:tcPr>
+          <w:p>
+            <w:pPr>
+              <w:spacing w:after="0" w:before="0" w:line="240"/>
+            </w:pPr>
+            <w:r>
+              <w:rPr>
+                <w:rFonts w:ascii="Calibri" w:cs="Calibri" w:eastAsia="Calibri" w:hAnsi="Calibri"/>
+                <w:b w:val="false"/>
+                <w:bCs w:val="false"/>
+                <w:sz w:val="18"/>
+                <w:szCs w:val="18"/>
+              </w:rPr>
+              <w:t>Wk 3 · Thu</w:t>
+            </w:r>
+          </w:p>
+        </w:tc>
+        <w:tc>
+          <w:tcPr>
+            <w:tcW w:type="dxa" w:w="5300"/>
+            <w:tcBorders>
+              <w:top w:val="single" w:color="D5DCE6" w:sz="4"/>
+              <w:left w:val="single" w:color="D5DCE6" w:sz="4"/>
+              <w:bottom w:val="single" w:color="D5DCE6" w:sz="4"/>
+              <w:right w:val="single" w:color="D5DCE6" w:sz="4"/>
+            </w:tcBorders>
+            <w:tcMar>
+              <w:top w:type="dxa" w:w="60"/>
+              <w:left w:type="dxa" w:w="100"/>
+              <w:bottom w:type="dxa" w:w="60"/>
+              <w:right w:type="dxa" w:w="100"/>
+            </w:tcMar>
+          </w:tcPr>
+          <w:p>
+            <w:pPr>
+              <w:spacing w:after="0" w:before="0" w:line="240"/>
+            </w:pPr>
+            <w:r>
+              <w:rPr>
+                <w:rFonts w:ascii="Calibri" w:cs="Calibri" w:eastAsia="Calibri" w:hAnsi="Calibri"/>
+                <w:b w:val="false"/>
+                <w:bCs w:val="false"/>
+                <w:sz w:val="18"/>
+                <w:szCs w:val="18"/>
+              </w:rPr>
+              <w:t>Book 40 — The Control That Moved</w:t>
+            </w:r>
+          </w:p>
+        </w:tc>
+        <w:tc>
+          <w:tcPr>
+            <w:tcW w:type="dxa" w:w="2980"/>
+            <w:tcBorders>
+              <w:top w:val="single" w:color="D5DCE6" w:sz="4"/>
+              <w:left w:val="single" w:color="D5DCE6" w:sz="4"/>
+              <w:bottom w:val="single" w:color="D5DCE6" w:sz="4"/>
+              <w:right w:val="single" w:color="D5DCE6" w:sz="4"/>
+            </w:tcBorders>
+            <w:tcMar>
+              <w:top w:type="dxa" w:w="60"/>
+              <w:left w:type="dxa" w:w="100"/>
+              <w:bottom w:type="dxa" w:w="60"/>
+              <w:right w:type="dxa" w:w="100"/>
+            </w:tcMar>
+          </w:tcPr>
+          <w:p>
+            <w:pPr>
+              <w:spacing w:after="0" w:before="0" w:line="240"/>
+            </w:pPr>
+            <w:r>
+              <w:rPr>
+                <w:rFonts w:ascii="Calibri" w:cs="Calibri" w:eastAsia="Calibri" w:hAnsi="Calibri"/>
+                <w:b w:val="false"/>
+                <w:bCs w:val="false"/>
+                <w:sz w:val="18"/>
+                <w:szCs w:val="18"/>
+              </w:rPr>
+            </w:r>
+          </w:p>
+        </w:tc>
+      </w:tr>
+      <w:tr>
+        <w:trPr>
+          <w:cantSplit/>
+        </w:trPr>
+        <w:tc>
+          <w:tcPr>
+            <w:tcW w:type="dxa" w:w="700"/>
+            <w:tcBorders>
+              <w:top w:val="single" w:color="D5DCE6" w:sz="4"/>
+              <w:left w:val="single" w:color="D5DCE6" w:sz="4"/>
+              <w:bottom w:val="single" w:color="D5DCE6" w:sz="4"/>
+              <w:right w:val="single" w:color="D5DCE6" w:sz="4"/>
+            </w:tcBorders>
+            <w:tcMar>
+              <w:top w:type="dxa" w:w="60"/>
+              <w:left w:type="dxa" w:w="100"/>
+              <w:bottom w:type="dxa" w:w="60"/>
+              <w:right w:type="dxa" w:w="100"/>
+            </w:tcMar>
+          </w:tcPr>
+          <w:p>
+            <w:pPr>
+              <w:spacing w:after="0" w:before="0" w:line="240"/>
+            </w:pPr>
+            <w:r>
+              <w:rPr>
+                <w:rFonts w:ascii="Calibri" w:cs="Calibri" w:eastAsia="Calibri" w:hAnsi="Calibri"/>
+                <w:b w:val="false"/>
+                <w:bCs w:val="false"/>
+                <w:sz w:val="18"/>
+                <w:szCs w:val="18"/>
+              </w:rPr>
+              <w:t>11</w:t>
+            </w:r>
+          </w:p>
+        </w:tc>
+        <w:tc>
+          <w:tcPr>
+            <w:tcW w:type="dxa" w:w="1100"/>
+            <w:tcBorders>
+              <w:top w:val="single" w:color="D5DCE6" w:sz="4"/>
+              <w:left w:val="single" w:color="D5DCE6" w:sz="4"/>
+              <w:bottom w:val="single" w:color="D5DCE6" w:sz="4"/>
+              <w:right w:val="single" w:color="D5DCE6" w:sz="4"/>
+            </w:tcBorders>
+            <w:tcMar>
+              <w:top w:type="dxa" w:w="60"/>
+              <w:left w:type="dxa" w:w="100"/>
+              <w:bottom w:type="dxa" w:w="60"/>
+              <w:right w:type="dxa" w:w="100"/>
+            </w:tcMar>
+          </w:tcPr>
+          <w:p>
+            <w:pPr>
+              <w:spacing w:after="0" w:before="0" w:line="240"/>
+            </w:pPr>
+            <w:r>
+              <w:rPr>
+                <w:rFonts w:ascii="Calibri" w:cs="Calibri" w:eastAsia="Calibri" w:hAnsi="Calibri"/>
+                <w:b w:val="false"/>
+                <w:bCs w:val="false"/>
+                <w:sz w:val="18"/>
+                <w:szCs w:val="18"/>
+              </w:rPr>
+              <w:t>Wk 3 · Sat</w:t>
+            </w:r>
+          </w:p>
+        </w:tc>
+        <w:tc>
+          <w:tcPr>
+            <w:tcW w:type="dxa" w:w="5300"/>
+            <w:tcBorders>
+              <w:top w:val="single" w:color="D5DCE6" w:sz="4"/>
+              <w:left w:val="single" w:color="D5DCE6" w:sz="4"/>
+              <w:bottom w:val="single" w:color="D5DCE6" w:sz="4"/>
+              <w:right w:val="single" w:color="D5DCE6" w:sz="4"/>
+            </w:tcBorders>
+            <w:tcMar>
+              <w:top w:type="dxa" w:w="60"/>
+              <w:left w:type="dxa" w:w="100"/>
+              <w:bottom w:type="dxa" w:w="60"/>
+              <w:right w:type="dxa" w:w="100"/>
+            </w:tcMar>
+          </w:tcPr>
+          <w:p>
+            <w:pPr>
+              <w:spacing w:after="0" w:before="0" w:line="240"/>
+            </w:pPr>
+            <w:r>
+              <w:rPr>
+                <w:rFonts w:ascii="Calibri" w:cs="Calibri" w:eastAsia="Calibri" w:hAnsi="Calibri"/>
+                <w:b w:val="false"/>
+                <w:bCs w:val="false"/>
+                <w:sz w:val="18"/>
+                <w:szCs w:val="18"/>
+              </w:rPr>
+              <w:t>Capstone — severity rating and Audit Committee readout preparation</w:t>
+            </w:r>
+          </w:p>
+        </w:tc>
+        <w:tc>
+          <w:tcPr>
+            <w:tcW w:type="dxa" w:w="2980"/>
+            <w:tcBorders>
+              <w:top w:val="single" w:color="D5DCE6" w:sz="4"/>
+              <w:left w:val="single" w:color="D5DCE6" w:sz="4"/>
+              <w:bottom w:val="single" w:color="D5DCE6" w:sz="4"/>
+              <w:right w:val="single" w:color="D5DCE6" w:sz="4"/>
+            </w:tcBorders>
+            <w:tcMar>
+              <w:top w:type="dxa" w:w="60"/>
+              <w:left w:type="dxa" w:w="100"/>
+              <w:bottom w:type="dxa" w:w="60"/>
+              <w:right w:type="dxa" w:w="100"/>
+            </w:tcMar>
+          </w:tcPr>
+          <w:p>
+            <w:pPr>
+              <w:spacing w:after="0" w:before="0" w:line="240"/>
+            </w:pPr>
+            <w:r>
+              <w:rPr>
+                <w:rFonts w:ascii="Calibri" w:cs="Calibri" w:eastAsia="Calibri" w:hAnsi="Calibri"/>
+                <w:b w:val="false"/>
+                <w:bCs w:val="false"/>
+                <w:sz w:val="18"/>
+                <w:szCs w:val="18"/>
+              </w:rPr>
+              <w:t>Deficiency memo marked</w:t>
+            </w:r>
+          </w:p>
+        </w:tc>
+      </w:tr>
+      <w:tr>
+        <w:trPr>
+          <w:cantSplit/>
+        </w:trPr>
+        <w:tc>
+          <w:tcPr>
+            <w:tcW w:type="dxa" w:w="700"/>
+            <w:tcBorders>
+              <w:top w:val="single" w:color="D5DCE6" w:sz="4"/>
+              <w:left w:val="single" w:color="D5DCE6" w:sz="4"/>
+              <w:bottom w:val="single" w:color="D5DCE6" w:sz="4"/>
+              <w:right w:val="single" w:color="D5DCE6" w:sz="4"/>
+            </w:tcBorders>
+            <w:tcMar>
+              <w:top w:type="dxa" w:w="60"/>
+              <w:left w:type="dxa" w:w="100"/>
+              <w:bottom w:type="dxa" w:w="60"/>
+              <w:right w:type="dxa" w:w="100"/>
+            </w:tcMar>
+          </w:tcPr>
+          <w:p>
+            <w:pPr>
+              <w:spacing w:after="0" w:before="0" w:line="240"/>
+            </w:pPr>
+            <w:r>
+              <w:rPr>
+                <w:rFonts w:ascii="Calibri" w:cs="Calibri" w:eastAsia="Calibri" w:hAnsi="Calibri"/>
+                <w:b w:val="false"/>
+                <w:bCs w:val="false"/>
+                <w:sz w:val="18"/>
+                <w:szCs w:val="18"/>
+              </w:rPr>
+              <w:t>12</w:t>
+            </w:r>
+          </w:p>
+        </w:tc>
+        <w:tc>
+          <w:tcPr>
+            <w:tcW w:type="dxa" w:w="1100"/>
+            <w:tcBorders>
+              <w:top w:val="single" w:color="D5DCE6" w:sz="4"/>
+              <w:left w:val="single" w:color="D5DCE6" w:sz="4"/>
+              <w:bottom w:val="single" w:color="D5DCE6" w:sz="4"/>
+              <w:right w:val="single" w:color="D5DCE6" w:sz="4"/>
+            </w:tcBorders>
+            <w:tcMar>
+              <w:top w:type="dxa" w:w="60"/>
+              <w:left w:type="dxa" w:w="100"/>
+              <w:bottom w:type="dxa" w:w="60"/>
+              <w:right w:type="dxa" w:w="100"/>
+            </w:tcMar>
+          </w:tcPr>
+          <w:p>
+            <w:pPr>
+              <w:spacing w:after="0" w:before="0" w:line="240"/>
+            </w:pPr>
+            <w:r>
+              <w:rPr>
+                <w:rFonts w:ascii="Calibri" w:cs="Calibri" w:eastAsia="Calibri" w:hAnsi="Calibri"/>
+                <w:b w:val="false"/>
+                <w:bCs w:val="false"/>
+                <w:sz w:val="18"/>
+                <w:szCs w:val="18"/>
+              </w:rPr>
+              <w:t>Wk 3 · Sun</w:t>
+            </w:r>
+          </w:p>
+        </w:tc>
+        <w:tc>
+          <w:tcPr>
+            <w:tcW w:type="dxa" w:w="5300"/>
+            <w:tcBorders>
+              <w:top w:val="single" w:color="D5DCE6" w:sz="4"/>
+              <w:left w:val="single" w:color="D5DCE6" w:sz="4"/>
+              <w:bottom w:val="single" w:color="D5DCE6" w:sz="4"/>
+              <w:right w:val="single" w:color="D5DCE6" w:sz="4"/>
+            </w:tcBorders>
+            <w:tcMar>
+              <w:top w:type="dxa" w:w="60"/>
+              <w:left w:type="dxa" w:w="100"/>
+              <w:bottom w:type="dxa" w:w="60"/>
+              <w:right w:type="dxa" w:w="100"/>
+            </w:tcMar>
+          </w:tcPr>
+          <w:p>
+            <w:pPr>
+              <w:spacing w:after="0" w:before="0" w:line="240"/>
+            </w:pPr>
+            <w:r>
+              <w:rPr>
+                <w:rFonts w:ascii="Calibri" w:cs="Calibri" w:eastAsia="Calibri" w:hAnsi="Calibri"/>
+                <w:b w:val="false"/>
+                <w:bCs w:val="false"/>
+                <w:sz w:val="18"/>
+                <w:szCs w:val="18"/>
+              </w:rPr>
+              <w:t>Stakeholder panel — one finding to an auditor</w:t>
+            </w:r>
+          </w:p>
+        </w:tc>
+        <w:tc>
+          <w:tcPr>
+            <w:tcW w:type="dxa" w:w="2980"/>
+            <w:tcBorders>
+              <w:top w:val="single" w:color="D5DCE6" w:sz="4"/>
+              <w:left w:val="single" w:color="D5DCE6" w:sz="4"/>
+              <w:bottom w:val="single" w:color="D5DCE6" w:sz="4"/>
+              <w:right w:val="single" w:color="D5DCE6" w:sz="4"/>
+            </w:tcBorders>
+            <w:tcMar>
+              <w:top w:type="dxa" w:w="60"/>
+              <w:left w:type="dxa" w:w="100"/>
+              <w:bottom w:type="dxa" w:w="60"/>
+              <w:right w:type="dxa" w:w="100"/>
+            </w:tcMar>
+          </w:tcPr>
+          <w:p>
+            <w:pPr>
+              <w:spacing w:after="0" w:before="0" w:line="240"/>
+            </w:pPr>
+            <w:r>
+              <w:rPr>
+                <w:rFonts w:ascii="Calibri" w:cs="Calibri" w:eastAsia="Calibri" w:hAnsi="Calibri"/>
+                <w:b w:val="false"/>
+                <w:bCs w:val="false"/>
+                <w:sz w:val="18"/>
+                <w:szCs w:val="18"/>
+              </w:rPr>
+              <w:t>Panel graded · Advanced certificate</w:t>
             </w:r>
           </w:p>
         </w:tc>
@@ -5267,7 +6588,7 @@
                 <w:sz w:val="19"/>
                 <w:szCs w:val="19"/>
               </w:rPr>
-              <w:t xml:space="preserve">sox-live-job-testing.vercel.app — all 46 Books, each with the exact screens, T-codes and a completed workpaper exhibit. Each Book is tagged Live · Session N, Beyond the Core, or Optional pre-work</w:t>
+              <w:t>sox-live-job-testing.vercel.app — all 46 Books, each with the exact screens, T-codes and a completed workpaper exhibit. Open the menu on By session to follow the course in order; ▶ Next takes you to the next session's Book. Each Book is tagged Intermediate, Advanced or Beyond the Core</w:t>
             </w:r>
           </w:p>
         </w:tc>
@@ -5472,7 +6793,7 @@
                 <w:sz w:val="19"/>
                 <w:szCs w:val="19"/>
               </w:rPr>
-              <w:t xml:space="preserve">This handbook, the Navigation Guide, templates, workpaper briefs and the Beyond the Core index</w:t>
+              <w:t>This handbook, the Trainee User Guide, Reading Packs, templates, assessment briefs and the Beyond the Core index</w:t>
             </w:r>
           </w:p>
         </w:tc>
@@ -5520,7 +6841,7 @@
           <w:sz w:val="21"/>
           <w:szCs w:val="21"/>
         </w:rPr>
-        <w:t xml:space="preserve">The app does not connect to SAP. Sign into SAP separately and run the two side by side — the Navigation Guide shows how.</w:t>
+        <w:t>The app does not connect to SAP. Sign into SAP separately and run the two side by side — the Trainee User Guide shows how.</w:t>
       </w:r>
     </w:p>
     <w:p>
@@ -5807,7 +7128,7 @@
                 <w:sz w:val="19"/>
                 <w:szCs w:val="19"/>
               </w:rPr>
-              <w:t xml:space="preserve">Workpaper 1</w:t>
+              <w:t>Workpaper 1</w:t>
             </w:r>
           </w:p>
         </w:tc>
@@ -5839,7 +7160,7 @@
                 <w:sz w:val="19"/>
                 <w:szCs w:val="19"/>
               </w:rPr>
-              <w:t xml:space="preserve">Access / SoD test — one of Books 1, 4, 7, 16, 17</w:t>
+              <w:t>Intermediate · Access / SoD test — one of Books 1, 4, 7, 16, 17</w:t>
             </w:r>
           </w:p>
         </w:tc>
@@ -5871,7 +7192,7 @@
                 <w:sz w:val="19"/>
                 <w:szCs w:val="19"/>
               </w:rPr>
-              <w:t xml:space="preserve">Assigned session 5 · due before session 8</w:t>
+              <w:t>Assigned session 6 · due before session 9</w:t>
             </w:r>
           </w:p>
         </w:tc>
@@ -5889,27 +7210,26 @@
               <w:bottom w:val="single" w:color="D5DCE6" w:sz="4"/>
               <w:right w:val="single" w:color="D5DCE6" w:sz="4"/>
             </w:tcBorders>
-            <w:shd w:fill="F5F8FC" w:color="auto" w:val="clear"/>
-            <w:tcMar>
-              <w:top w:type="dxa" w:w="60"/>
-              <w:left w:type="dxa" w:w="100"/>
-              <w:bottom w:type="dxa" w:w="60"/>
-              <w:right w:type="dxa" w:w="100"/>
-            </w:tcMar>
-          </w:tcPr>
-          <w:p>
-            <w:pPr>
-              <w:spacing w:after="0" w:before="0" w:line="240"/>
-            </w:pPr>
-            <w:r>
-              <w:rPr>
-                <w:rFonts w:ascii="Calibri" w:cs="Calibri" w:eastAsia="Calibri" w:hAnsi="Calibri"/>
-                <w:b w:val="false"/>
-                <w:bCs w:val="false"/>
-                <w:sz w:val="19"/>
-                <w:szCs w:val="19"/>
-              </w:rPr>
-              <w:t xml:space="preserve">Workpaper 2</w:t>
+            <w:tcMar>
+              <w:top w:type="dxa" w:w="60"/>
+              <w:left w:type="dxa" w:w="100"/>
+              <w:bottom w:type="dxa" w:w="60"/>
+              <w:right w:type="dxa" w:w="100"/>
+            </w:tcMar>
+          </w:tcPr>
+          <w:p>
+            <w:pPr>
+              <w:spacing w:after="0" w:before="0" w:line="240"/>
+            </w:pPr>
+            <w:r>
+              <w:rPr>
+                <w:rFonts w:ascii="Calibri" w:cs="Calibri" w:eastAsia="Calibri" w:hAnsi="Calibri"/>
+                <w:b w:val="false"/>
+                <w:bCs w:val="false"/>
+                <w:sz w:val="19"/>
+                <w:szCs w:val="19"/>
+              </w:rPr>
+              <w:t>Workpaper 2</w:t>
             </w:r>
           </w:p>
         </w:tc>
@@ -5922,27 +7242,26 @@
               <w:bottom w:val="single" w:color="D5DCE6" w:sz="4"/>
               <w:right w:val="single" w:color="D5DCE6" w:sz="4"/>
             </w:tcBorders>
-            <w:shd w:fill="F5F8FC" w:color="auto" w:val="clear"/>
-            <w:tcMar>
-              <w:top w:type="dxa" w:w="60"/>
-              <w:left w:type="dxa" w:w="100"/>
-              <w:bottom w:type="dxa" w:w="60"/>
-              <w:right w:type="dxa" w:w="100"/>
-            </w:tcMar>
-          </w:tcPr>
-          <w:p>
-            <w:pPr>
-              <w:spacing w:after="0" w:before="0" w:line="240"/>
-            </w:pPr>
-            <w:r>
-              <w:rPr>
-                <w:rFonts w:ascii="Calibri" w:cs="Calibri" w:eastAsia="Calibri" w:hAnsi="Calibri"/>
-                <w:b w:val="false"/>
-                <w:bCs w:val="false"/>
-                <w:sz w:val="19"/>
-                <w:szCs w:val="19"/>
-              </w:rPr>
-              <w:t xml:space="preserve">Change-management test — one of Books 2, 18, 19, 20</w:t>
+            <w:tcMar>
+              <w:top w:type="dxa" w:w="60"/>
+              <w:left w:type="dxa" w:w="100"/>
+              <w:bottom w:type="dxa" w:w="60"/>
+              <w:right w:type="dxa" w:w="100"/>
+            </w:tcMar>
+          </w:tcPr>
+          <w:p>
+            <w:pPr>
+              <w:spacing w:after="0" w:before="0" w:line="240"/>
+            </w:pPr>
+            <w:r>
+              <w:rPr>
+                <w:rFonts w:ascii="Calibri" w:cs="Calibri" w:eastAsia="Calibri" w:hAnsi="Calibri"/>
+                <w:b w:val="false"/>
+                <w:bCs w:val="false"/>
+                <w:sz w:val="19"/>
+                <w:szCs w:val="19"/>
+              </w:rPr>
+              <w:t>Intermediate · Change-management test — one of Books 2, 18, 19, 20</w:t>
             </w:r>
           </w:p>
         </w:tc>
@@ -5955,27 +7274,26 @@
               <w:bottom w:val="single" w:color="D5DCE6" w:sz="4"/>
               <w:right w:val="single" w:color="D5DCE6" w:sz="4"/>
             </w:tcBorders>
-            <w:shd w:fill="F5F8FC" w:color="auto" w:val="clear"/>
-            <w:tcMar>
-              <w:top w:type="dxa" w:w="60"/>
-              <w:left w:type="dxa" w:w="100"/>
-              <w:bottom w:type="dxa" w:w="60"/>
-              <w:right w:type="dxa" w:w="100"/>
-            </w:tcMar>
-          </w:tcPr>
-          <w:p>
-            <w:pPr>
-              <w:spacing w:after="0" w:before="0" w:line="240"/>
-            </w:pPr>
-            <w:r>
-              <w:rPr>
-                <w:rFonts w:ascii="Calibri" w:cs="Calibri" w:eastAsia="Calibri" w:hAnsi="Calibri"/>
-                <w:b w:val="false"/>
-                <w:bCs w:val="false"/>
-                <w:sz w:val="19"/>
-                <w:szCs w:val="19"/>
-              </w:rPr>
-              <w:t xml:space="preserve">Assigned session 8 · due before session 13</w:t>
+            <w:tcMar>
+              <w:top w:type="dxa" w:w="60"/>
+              <w:left w:type="dxa" w:w="100"/>
+              <w:bottom w:type="dxa" w:w="60"/>
+              <w:right w:type="dxa" w:w="100"/>
+            </w:tcMar>
+          </w:tcPr>
+          <w:p>
+            <w:pPr>
+              <w:spacing w:after="0" w:before="0" w:line="240"/>
+            </w:pPr>
+            <w:r>
+              <w:rPr>
+                <w:rFonts w:ascii="Calibri" w:cs="Calibri" w:eastAsia="Calibri" w:hAnsi="Calibri"/>
+                <w:b w:val="false"/>
+                <w:bCs w:val="false"/>
+                <w:sz w:val="19"/>
+                <w:szCs w:val="19"/>
+              </w:rPr>
+              <w:t>Assigned session 9 · due before session 13</w:t>
             </w:r>
           </w:p>
         </w:tc>
@@ -6012,7 +7330,7 @@
                 <w:sz w:val="19"/>
                 <w:szCs w:val="19"/>
               </w:rPr>
-              <w:t xml:space="preserve">Midpoint RCM</w:t>
+              <w:t>Workpaper 3</w:t>
             </w:r>
           </w:p>
         </w:tc>
@@ -6044,7 +7362,7 @@
                 <w:sz w:val="19"/>
                 <w:szCs w:val="19"/>
               </w:rPr>
-              <w:t xml:space="preserve">Build the Thornfield Risk &amp; Control Matrix</w:t>
+              <w:t>Intermediate · Application or Order-to-Cash test — one of Books 24–27, 29, 30</w:t>
             </w:r>
           </w:p>
         </w:tc>
@@ -6076,7 +7394,7 @@
                 <w:sz w:val="19"/>
                 <w:szCs w:val="19"/>
               </w:rPr>
-              <w:t xml:space="preserve">In session 11</w:t>
+              <w:t>Assigned session 13 · due before session 16</w:t>
             </w:r>
           </w:p>
         </w:tc>
@@ -6094,27 +7412,26 @@
               <w:bottom w:val="single" w:color="D5DCE6" w:sz="4"/>
               <w:right w:val="single" w:color="D5DCE6" w:sz="4"/>
             </w:tcBorders>
-            <w:shd w:fill="F5F8FC" w:color="auto" w:val="clear"/>
-            <w:tcMar>
-              <w:top w:type="dxa" w:w="60"/>
-              <w:left w:type="dxa" w:w="100"/>
-              <w:bottom w:type="dxa" w:w="60"/>
-              <w:right w:type="dxa" w:w="100"/>
-            </w:tcMar>
-          </w:tcPr>
-          <w:p>
-            <w:pPr>
-              <w:spacing w:after="0" w:before="0" w:line="240"/>
-            </w:pPr>
-            <w:r>
-              <w:rPr>
-                <w:rFonts w:ascii="Calibri" w:cs="Calibri" w:eastAsia="Calibri" w:hAnsi="Calibri"/>
-                <w:b w:val="false"/>
-                <w:bCs w:val="false"/>
-                <w:sz w:val="19"/>
-                <w:szCs w:val="19"/>
-              </w:rPr>
-              <w:t xml:space="preserve">Workpaper 3</w:t>
+            <w:tcMar>
+              <w:top w:type="dxa" w:w="60"/>
+              <w:left w:type="dxa" w:w="100"/>
+              <w:bottom w:type="dxa" w:w="60"/>
+              <w:right w:type="dxa" w:w="100"/>
+            </w:tcMar>
+          </w:tcPr>
+          <w:p>
+            <w:pPr>
+              <w:spacing w:after="0" w:before="0" w:line="240"/>
+            </w:pPr>
+            <w:r>
+              <w:rPr>
+                <w:rFonts w:ascii="Calibri" w:cs="Calibri" w:eastAsia="Calibri" w:hAnsi="Calibri"/>
+                <w:b w:val="false"/>
+                <w:bCs w:val="false"/>
+                <w:sz w:val="19"/>
+                <w:szCs w:val="19"/>
+              </w:rPr>
+              <w:t>Thornfield RCM</w:t>
             </w:r>
           </w:p>
         </w:tc>
@@ -6127,27 +7444,26 @@
               <w:bottom w:val="single" w:color="D5DCE6" w:sz="4"/>
               <w:right w:val="single" w:color="D5DCE6" w:sz="4"/>
             </w:tcBorders>
-            <w:shd w:fill="F5F8FC" w:color="auto" w:val="clear"/>
-            <w:tcMar>
-              <w:top w:type="dxa" w:w="60"/>
-              <w:left w:type="dxa" w:w="100"/>
-              <w:bottom w:type="dxa" w:w="60"/>
-              <w:right w:type="dxa" w:w="100"/>
-            </w:tcMar>
-          </w:tcPr>
-          <w:p>
-            <w:pPr>
-              <w:spacing w:after="0" w:before="0" w:line="240"/>
-            </w:pPr>
-            <w:r>
-              <w:rPr>
-                <w:rFonts w:ascii="Calibri" w:cs="Calibri" w:eastAsia="Calibri" w:hAnsi="Calibri"/>
-                <w:b w:val="false"/>
-                <w:bCs w:val="false"/>
-                <w:sz w:val="19"/>
-                <w:szCs w:val="19"/>
-              </w:rPr>
-              <w:t xml:space="preserve">Application or Order-to-Cash test, with a severity rating — one of Books 24–27, 29, 30</w:t>
+            <w:tcMar>
+              <w:top w:type="dxa" w:w="60"/>
+              <w:left w:type="dxa" w:w="100"/>
+              <w:bottom w:type="dxa" w:w="60"/>
+              <w:right w:type="dxa" w:w="100"/>
+            </w:tcMar>
+          </w:tcPr>
+          <w:p>
+            <w:pPr>
+              <w:spacing w:after="0" w:before="0" w:line="240"/>
+            </w:pPr>
+            <w:r>
+              <w:rPr>
+                <w:rFonts w:ascii="Calibri" w:cs="Calibri" w:eastAsia="Calibri" w:hAnsi="Calibri"/>
+                <w:b w:val="false"/>
+                <w:bCs w:val="false"/>
+                <w:sz w:val="19"/>
+                <w:szCs w:val="19"/>
+              </w:rPr>
+              <w:t>Advanced · Build the Thornfield Risk &amp; Control Matrix and select key controls</w:t>
             </w:r>
           </w:p>
         </w:tc>
@@ -6160,27 +7476,26 @@
               <w:bottom w:val="single" w:color="D5DCE6" w:sz="4"/>
               <w:right w:val="single" w:color="D5DCE6" w:sz="4"/>
             </w:tcBorders>
-            <w:shd w:fill="F5F8FC" w:color="auto" w:val="clear"/>
-            <w:tcMar>
-              <w:top w:type="dxa" w:w="60"/>
-              <w:left w:type="dxa" w:w="100"/>
-              <w:bottom w:type="dxa" w:w="60"/>
-              <w:right w:type="dxa" w:w="100"/>
-            </w:tcMar>
-          </w:tcPr>
-          <w:p>
-            <w:pPr>
-              <w:spacing w:after="0" w:before="0" w:line="240"/>
-            </w:pPr>
-            <w:r>
-              <w:rPr>
-                <w:rFonts w:ascii="Calibri" w:cs="Calibri" w:eastAsia="Calibri" w:hAnsi="Calibri"/>
-                <w:b w:val="false"/>
-                <w:bCs w:val="false"/>
-                <w:sz w:val="19"/>
-                <w:szCs w:val="19"/>
-              </w:rPr>
-              <w:t xml:space="preserve">Assigned session 17 · due before session 19</w:t>
+            <w:tcMar>
+              <w:top w:type="dxa" w:w="60"/>
+              <w:left w:type="dxa" w:w="100"/>
+              <w:bottom w:type="dxa" w:w="60"/>
+              <w:right w:type="dxa" w:w="100"/>
+            </w:tcMar>
+          </w:tcPr>
+          <w:p>
+            <w:pPr>
+              <w:spacing w:after="0" w:before="0" w:line="240"/>
+            </w:pPr>
+            <w:r>
+              <w:rPr>
+                <w:rFonts w:ascii="Calibri" w:cs="Calibri" w:eastAsia="Calibri" w:hAnsi="Calibri"/>
+                <w:b w:val="false"/>
+                <w:bCs w:val="false"/>
+                <w:sz w:val="19"/>
+                <w:szCs w:val="19"/>
+              </w:rPr>
+              <w:t>Advanced session 3</w:t>
             </w:r>
           </w:p>
         </w:tc>
@@ -6217,7 +7532,7 @@
                 <w:sz w:val="19"/>
                 <w:szCs w:val="19"/>
               </w:rPr>
-              <w:t xml:space="preserve">Defend It</w:t>
+              <w:t>Deficiency memo</w:t>
             </w:r>
           </w:p>
         </w:tc>
@@ -6249,7 +7564,7 @@
                 <w:sz w:val="19"/>
                 <w:szCs w:val="19"/>
               </w:rPr>
-              <w:t xml:space="preserve">Present and defend your conclusion — four turns</w:t>
+              <w:t>Advanced · Rate one finding — deficiency, significant deficiency or material weakness</w:t>
             </w:r>
           </w:p>
         </w:tc>
@@ -6281,7 +7596,7 @@
                 <w:sz w:val="19"/>
                 <w:szCs w:val="19"/>
               </w:rPr>
-              <w:t xml:space="preserve">Sessions 2–19 (rota set in session 1)</w:t>
+              <w:t>Assigned Advanced session 6 · due before session 11</w:t>
             </w:r>
           </w:p>
         </w:tc>
@@ -6299,27 +7614,26 @@
               <w:bottom w:val="single" w:color="D5DCE6" w:sz="4"/>
               <w:right w:val="single" w:color="D5DCE6" w:sz="4"/>
             </w:tcBorders>
-            <w:shd w:fill="F5F8FC" w:color="auto" w:val="clear"/>
-            <w:tcMar>
-              <w:top w:type="dxa" w:w="60"/>
-              <w:left w:type="dxa" w:w="100"/>
-              <w:bottom w:type="dxa" w:w="60"/>
-              <w:right w:type="dxa" w:w="100"/>
-            </w:tcMar>
-          </w:tcPr>
-          <w:p>
-            <w:pPr>
-              <w:spacing w:after="0" w:before="0" w:line="240"/>
-            </w:pPr>
-            <w:r>
-              <w:rPr>
-                <w:rFonts w:ascii="Calibri" w:cs="Calibri" w:eastAsia="Calibri" w:hAnsi="Calibri"/>
-                <w:b w:val="false"/>
-                <w:bCs w:val="false"/>
-                <w:sz w:val="19"/>
-                <w:szCs w:val="19"/>
-              </w:rPr>
-              <w:t xml:space="preserve">Stakeholder panel</w:t>
+            <w:tcMar>
+              <w:top w:type="dxa" w:w="60"/>
+              <w:left w:type="dxa" w:w="100"/>
+              <w:bottom w:type="dxa" w:w="60"/>
+              <w:right w:type="dxa" w:w="100"/>
+            </w:tcMar>
+          </w:tcPr>
+          <w:p>
+            <w:pPr>
+              <w:spacing w:after="0" w:before="0" w:line="240"/>
+            </w:pPr>
+            <w:r>
+              <w:rPr>
+                <w:rFonts w:ascii="Calibri" w:cs="Calibri" w:eastAsia="Calibri" w:hAnsi="Calibri"/>
+                <w:b w:val="false"/>
+                <w:bCs w:val="false"/>
+                <w:sz w:val="19"/>
+                <w:szCs w:val="19"/>
+              </w:rPr>
+              <w:t>Defend It</w:t>
             </w:r>
           </w:p>
         </w:tc>
@@ -6332,27 +7646,26 @@
               <w:bottom w:val="single" w:color="D5DCE6" w:sz="4"/>
               <w:right w:val="single" w:color="D5DCE6" w:sz="4"/>
             </w:tcBorders>
-            <w:shd w:fill="F5F8FC" w:color="auto" w:val="clear"/>
-            <w:tcMar>
-              <w:top w:type="dxa" w:w="60"/>
-              <w:left w:type="dxa" w:w="100"/>
-              <w:bottom w:type="dxa" w:w="60"/>
-              <w:right w:type="dxa" w:w="100"/>
-            </w:tcMar>
-          </w:tcPr>
-          <w:p>
-            <w:pPr>
-              <w:spacing w:after="0" w:before="0" w:line="240"/>
-            </w:pPr>
-            <w:r>
-              <w:rPr>
-                <w:rFonts w:ascii="Calibri" w:cs="Calibri" w:eastAsia="Calibri" w:hAnsi="Calibri"/>
-                <w:b w:val="false"/>
-                <w:bCs w:val="false"/>
-                <w:sz w:val="19"/>
-                <w:szCs w:val="19"/>
-              </w:rPr>
-              <w:t xml:space="preserve">One finding, presented to an auditor, a developer and a CFO</w:t>
+            <w:tcMar>
+              <w:top w:type="dxa" w:w="60"/>
+              <w:left w:type="dxa" w:w="100"/>
+              <w:bottom w:type="dxa" w:w="60"/>
+              <w:right w:type="dxa" w:w="100"/>
+            </w:tcMar>
+          </w:tcPr>
+          <w:p>
+            <w:pPr>
+              <w:spacing w:after="0" w:before="0" w:line="240"/>
+            </w:pPr>
+            <w:r>
+              <w:rPr>
+                <w:rFonts w:ascii="Calibri" w:cs="Calibri" w:eastAsia="Calibri" w:hAnsi="Calibri"/>
+                <w:b w:val="false"/>
+                <w:bCs w:val="false"/>
+                <w:sz w:val="19"/>
+                <w:szCs w:val="19"/>
+              </w:rPr>
+              <w:t>Present and defend your conclusion</w:t>
             </w:r>
           </w:p>
         </w:tc>
@@ -6365,27 +7678,127 @@
               <w:bottom w:val="single" w:color="D5DCE6" w:sz="4"/>
               <w:right w:val="single" w:color="D5DCE6" w:sz="4"/>
             </w:tcBorders>
-            <w:shd w:fill="F5F8FC" w:color="auto" w:val="clear"/>
-            <w:tcMar>
-              <w:top w:type="dxa" w:w="60"/>
-              <w:left w:type="dxa" w:w="100"/>
-              <w:bottom w:type="dxa" w:w="60"/>
-              <w:right w:type="dxa" w:w="100"/>
-            </w:tcMar>
-          </w:tcPr>
-          <w:p>
-            <w:pPr>
-              <w:spacing w:after="0" w:before="0" w:line="240"/>
-            </w:pPr>
-            <w:r>
-              <w:rPr>
-                <w:rFonts w:ascii="Calibri" w:cs="Calibri" w:eastAsia="Calibri" w:hAnsi="Calibri"/>
-                <w:b w:val="false"/>
-                <w:bCs w:val="false"/>
-                <w:sz w:val="19"/>
-                <w:szCs w:val="19"/>
-              </w:rPr>
-              <w:t xml:space="preserve">Session 20</w:t>
+            <w:tcMar>
+              <w:top w:type="dxa" w:w="60"/>
+              <w:left w:type="dxa" w:w="100"/>
+              <w:bottom w:type="dxa" w:w="60"/>
+              <w:right w:type="dxa" w:w="100"/>
+            </w:tcMar>
+          </w:tcPr>
+          <w:p>
+            <w:pPr>
+              <w:spacing w:after="0" w:before="0" w:line="240"/>
+            </w:pPr>
+            <w:r>
+              <w:rPr>
+                <w:rFonts w:ascii="Calibri" w:cs="Calibri" w:eastAsia="Calibri" w:hAnsi="Calibri"/>
+                <w:b w:val="false"/>
+                <w:bCs w:val="false"/>
+                <w:sz w:val="19"/>
+                <w:szCs w:val="19"/>
+              </w:rPr>
+              <w:t>Book sessions at both levels (rota set in session 1)</w:t>
+            </w:r>
+          </w:p>
+        </w:tc>
+      </w:tr>
+      <w:tr>
+        <w:trPr>
+          <w:cantSplit/>
+        </w:trPr>
+        <w:tc>
+          <w:tcPr>
+            <w:tcW w:type="dxa" w:w="2300"/>
+            <w:tcBorders>
+              <w:top w:val="single" w:color="D5DCE6" w:sz="4"/>
+              <w:left w:val="single" w:color="D5DCE6" w:sz="4"/>
+              <w:bottom w:val="single" w:color="D5DCE6" w:sz="4"/>
+              <w:right w:val="single" w:color="D5DCE6" w:sz="4"/>
+            </w:tcBorders>
+            <w:tcMar>
+              <w:top w:type="dxa" w:w="60"/>
+              <w:left w:type="dxa" w:w="100"/>
+              <w:bottom w:type="dxa" w:w="60"/>
+              <w:right w:type="dxa" w:w="100"/>
+            </w:tcMar>
+          </w:tcPr>
+          <w:p>
+            <w:pPr>
+              <w:spacing w:after="0" w:before="0" w:line="240"/>
+            </w:pPr>
+            <w:r>
+              <w:rPr>
+                <w:rFonts w:ascii="Calibri" w:cs="Calibri" w:eastAsia="Calibri" w:hAnsi="Calibri"/>
+                <w:b w:val="false"/>
+                <w:bCs w:val="false"/>
+                <w:sz w:val="19"/>
+                <w:szCs w:val="19"/>
+              </w:rPr>
+              <w:t>Stakeholder panel</w:t>
+            </w:r>
+          </w:p>
+        </w:tc>
+        <w:tc>
+          <w:tcPr>
+            <w:tcW w:type="dxa" w:w="3700"/>
+            <w:tcBorders>
+              <w:top w:val="single" w:color="D5DCE6" w:sz="4"/>
+              <w:left w:val="single" w:color="D5DCE6" w:sz="4"/>
+              <w:bottom w:val="single" w:color="D5DCE6" w:sz="4"/>
+              <w:right w:val="single" w:color="D5DCE6" w:sz="4"/>
+            </w:tcBorders>
+            <w:tcMar>
+              <w:top w:type="dxa" w:w="60"/>
+              <w:left w:type="dxa" w:w="100"/>
+              <w:bottom w:type="dxa" w:w="60"/>
+              <w:right w:type="dxa" w:w="100"/>
+            </w:tcMar>
+          </w:tcPr>
+          <w:p>
+            <w:pPr>
+              <w:spacing w:after="0" w:before="0" w:line="240"/>
+            </w:pPr>
+            <w:r>
+              <w:rPr>
+                <w:rFonts w:ascii="Calibri" w:cs="Calibri" w:eastAsia="Calibri" w:hAnsi="Calibri"/>
+                <w:b w:val="false"/>
+                <w:bCs w:val="false"/>
+                <w:sz w:val="19"/>
+                <w:szCs w:val="19"/>
+              </w:rPr>
+              <w:t>Advanced · One finding, presented to an auditor, an SAP developer and a CFO</w:t>
+            </w:r>
+          </w:p>
+        </w:tc>
+        <w:tc>
+          <w:tcPr>
+            <w:tcW w:type="dxa" w:w="4080"/>
+            <w:tcBorders>
+              <w:top w:val="single" w:color="D5DCE6" w:sz="4"/>
+              <w:left w:val="single" w:color="D5DCE6" w:sz="4"/>
+              <w:bottom w:val="single" w:color="D5DCE6" w:sz="4"/>
+              <w:right w:val="single" w:color="D5DCE6" w:sz="4"/>
+            </w:tcBorders>
+            <w:tcMar>
+              <w:top w:type="dxa" w:w="60"/>
+              <w:left w:type="dxa" w:w="100"/>
+              <w:bottom w:type="dxa" w:w="60"/>
+              <w:right w:type="dxa" w:w="100"/>
+            </w:tcMar>
+          </w:tcPr>
+          <w:p>
+            <w:pPr>
+              <w:spacing w:after="0" w:before="0" w:line="240"/>
+            </w:pPr>
+            <w:r>
+              <w:rPr>
+                <w:rFonts w:ascii="Calibri" w:cs="Calibri" w:eastAsia="Calibri" w:hAnsi="Calibri"/>
+                <w:b w:val="false"/>
+                <w:bCs w:val="false"/>
+                <w:sz w:val="19"/>
+                <w:szCs w:val="19"/>
+              </w:rPr>
+              <w:t>Advanced session 12</w:t>
             </w:r>
           </w:p>
         </w:tc>
@@ -6401,7 +7814,7 @@
           <w:sz w:val="21"/>
           <w:szCs w:val="21"/>
         </w:rPr>
-        <w:t xml:space="preserve">Full briefs are in Workpaper Briefs 1–3 and the Stakeholder Panel Brief in your assessment folder. Use the Workpaper Template and Standard and a Planning Card for each workpaper.</w:t>
+        <w:t>Full briefs are in Workpaper Briefs 1–3, the Midpoint RCM Exercise and the Stakeholder Panel Brief in your assessment folder. Use the Workpaper Template and Standard and a Planning Card for each workpaper.</w:t>
       </w:r>
     </w:p>
     <w:tbl>
@@ -6450,7 +7863,7 @@
                 <w:sz w:val="20"/>
                 <w:szCs w:val="20"/>
               </w:rPr>
-              <w:t xml:space="preserve">SEVERITY — WHEN TO STATE IT</w:t>
+              <w:t>SEVERITY — WHEN TO STATE IT</w:t>
             </w:r>
           </w:p>
           <w:p>
@@ -6463,7 +7876,7 @@
                 <w:sz w:val="20"/>
                 <w:szCs w:val="20"/>
               </w:rPr>
-              <w:t xml:space="preserve">Workpapers 1 and 2: state the facts and your conclusion (effective / not effective). Do not call a deficiency “minor” or “immaterial” — severity depends on thresholds you do not have yet.</w:t>
+              <w:t>Workpapers 1–3 (Intermediate): state the facts and your conclusion (effective / not effective). Do not call a deficiency “minor” or “immaterial” — severity depends on thresholds you do not have yet.</w:t>
             </w:r>
           </w:p>
           <w:p>
@@ -6476,7 +7889,7 @@
                 <w:sz w:val="20"/>
                 <w:szCs w:val="20"/>
               </w:rPr>
-              <w:t xml:space="preserve">Workpaper 3: after the Manager Track (Book 39), you do rate severity — deficiency, significant deficiency or material weakness — with a one-sentence justification.</w:t>
+              <w:t>Deficiency memo (Advanced): after Book 39, you do rate severity — deficiency, significant deficiency or material weakness — with a one-sentence justification.</w:t>
             </w:r>
           </w:p>
         </w:tc>
@@ -7134,7 +8547,7 @@
           <w:sz w:val="21"/>
           <w:szCs w:val="21"/>
         </w:rPr>
-        <w:t xml:space="preserve">Certificate: prerequisite exam passed + every live Book completed in the app (including the Manager Track) + Workpapers 1–3 passed + stakeholder panel passed. Beyond the Core Books are optional.</w:t>
+        <w:t>Certificates: Intermediate — prerequisite exam passed + all 19 Intermediate Books completed in the app (15 live + 4 guided self-study) + Workpapers 1–3 passed. Advanced — all 8 Advanced Books completed + Thornfield RCM, deficiency memo and stakeholder panel passed. Beyond the Core Books are optional.</w:t>
       </w:r>
     </w:p>
     <w:p>
@@ -7359,7 +8772,7 @@
           <w:sz w:val="21"/>
           <w:szCs w:val="21"/>
         </w:rPr>
-        <w:t xml:space="preserve">One — the Controls Theory prerequisite exam, before session 1. After that you are assessed on your workpapers, the RCM, Defend It and the panel.</w:t>
+        <w:t>One — the Controls Theory prerequisite exam, before session 1. After that you are assessed on your workpapers, Defend It and, at the Advanced level, the RCM, the deficiency memo and the panel.</w:t>
       </w:r>
     </w:p>
     <w:p>
@@ -7419,7 +8832,7 @@
           <w:sz w:val="21"/>
           <w:szCs w:val="21"/>
         </w:rPr>
-        <w:t xml:space="preserve">23 Books not taught live — Treasury &amp; Tax, Payroll, Governance &amp; Disclosure, Clean Core/RISE, third-party tools and more. Same format in the app, optional, yours to keep. See the Beyond the Core Library Index.</w:t>
+        <w:t>19 Books not taught live — Treasury &amp; Tax, Payroll, Governance &amp; Disclosure, legal and compliance scope and more. Same format in the app, optional, yours to keep. Find them under By Part in the app menu, and in the Beyond the Core Library Index.</w:t>
       </w:r>
     </w:p>
     <w:p>
@@ -7450,6 +8863,36 @@
           <w:szCs w:val="21"/>
         </w:rPr>
         <w:t xml:space="preserve">Some of it. But using SAP is not the same as understanding why its controls are built the way they are — or defending a conclusion to a reviewer.</w:t>
+      </w:r>
+    </w:p>
+    <w:p>
+      <w:pPr>
+        <w:spacing w:after="40" w:before="120" w:line="240"/>
+      </w:pPr>
+      <w:r>
+        <w:rPr>
+          <w:rFonts w:ascii="Calibri" w:cs="Calibri" w:eastAsia="Calibri" w:hAnsi="Calibri"/>
+          <w:b/>
+          <w:bCs/>
+          <w:caps/>
+          <w:color w:val="1F6B67"/>
+          <w:sz w:val="20"/>
+          <w:szCs w:val="20"/>
+        </w:rPr>
+        <w:t>Can I do the course as self-study?</w:t>
+      </w:r>
+    </w:p>
+    <w:p>
+      <w:pPr>
+        <w:spacing w:after="80" w:before="0" w:line="240"/>
+      </w:pPr>
+      <w:r>
+        <w:rPr>
+          <w:rFonts w:ascii="Calibri" w:cs="Calibri" w:eastAsia="Calibri" w:hAnsi="Calibri"/>
+          <w:sz w:val="21"/>
+          <w:szCs w:val="21"/>
+        </w:rPr>
+        <w:t>Yes. The Trainee User Guide gives you the same route session by session, and the Reading Packs follow the same order. Your workpapers, RCM, deficiency memo and stakeholder panel are still marked by TIB instructors — that is what earns the certificate.</w:t>
       </w:r>
     </w:p>
     <w:p>
@@ -7622,7 +9065,7 @@
                 <w:sz w:val="19"/>
                 <w:szCs w:val="19"/>
               </w:rPr>
-              <w:t xml:space="preserve">Student Handbook · Navigation Guide · Beyond the Core Library Index</w:t>
+              <w:t>Student Handbook · Trainee User Guide · Beyond the Core Library Index</w:t>
             </w:r>
           </w:p>
         </w:tc>
@@ -7833,7 +9276,7 @@
                 <w:sz w:val="19"/>
                 <w:szCs w:val="19"/>
               </w:rPr>
-              <w:t xml:space="preserve">Reading Packs</w:t>
+              <w:t>Reading Packs — Intermediate Weeks 1–4 · Advanced Weeks 1–3</w:t>
             </w:r>
           </w:p>
         </w:tc>

</xml_diff>

<commit_message>
Exact 23:59 CT deadlines for Workpapers 1-3, RCM and deficiency memo across Handbook, User Guide, Reading Packs and Workpaper Briefs
Co-Authored-By: Claude Opus 5.5 <noreply@anthropic.com>
Claude-Session: https://claude.ai/code/session_018fWq9UNCNi5rGqwUiTA1Zk
</commit_message>
<xml_diff>
--- a/materials/00-start-here/Student-Handbook-START-HERE.docx
+++ b/materials/00-start-here/Student-Handbook-START-HERE.docx
@@ -3218,7 +3218,7 @@
                 <w:sz w:val="18"/>
                 <w:szCs w:val="18"/>
               </w:rPr>
-              <w:t>Workpaper 1 (Access / SoD) assigned — due before session 9</w:t>
+              <w:t>Workpaper 1 (Access / SoD) assigned — due 23:59 CT on the day of session 8</w:t>
             </w:r>
           </w:p>
         </w:tc>
@@ -3615,7 +3615,7 @@
                 <w:sz w:val="18"/>
                 <w:szCs w:val="18"/>
               </w:rPr>
-              <w:t>Workpaper 2 (Change &amp; Operations) assigned — due before session 13 · Workpaper 1 returned marked</w:t>
+              <w:t>Workpaper 2 (Change &amp; Operations) assigned — due 23:59 CT on the day of session 12 · Workpaper 1 returned marked</w:t>
             </w:r>
           </w:p>
         </w:tc>
@@ -4144,7 +4144,7 @@
                 <w:sz w:val="18"/>
                 <w:szCs w:val="18"/>
               </w:rPr>
-              <w:t>Workpaper 3 (ITAC — P2P / OTC) assigned — due before session 16 · Workpaper 2 returned marked</w:t>
+              <w:t>Workpaper 3 (ITAC — P2P / OTC) assigned — due 23:59 CT on the day of session 15 · Workpaper 2 returned marked</w:t>
             </w:r>
           </w:p>
         </w:tc>
@@ -5513,7 +5513,7 @@
                 <w:sz w:val="18"/>
                 <w:szCs w:val="18"/>
               </w:rPr>
-              <w:t>Deficiency memo assigned — due before session 11</w:t>
+              <w:t>Deficiency memo assigned — due 23:59 CT on the day of session 10</w:t>
             </w:r>
           </w:p>
         </w:tc>
@@ -7192,7 +7192,7 @@
                 <w:sz w:val="19"/>
                 <w:szCs w:val="19"/>
               </w:rPr>
-              <w:t>Assigned session 6 · due before session 9</w:t>
+              <w:t>Assigned session 6 · due 23:59 CT on the day of session 8</w:t>
             </w:r>
           </w:p>
         </w:tc>
@@ -7293,7 +7293,7 @@
                 <w:sz w:val="19"/>
                 <w:szCs w:val="19"/>
               </w:rPr>
-              <w:t>Assigned session 9 · due before session 13</w:t>
+              <w:t>Assigned session 9 · due 23:59 CT on the day of session 12</w:t>
             </w:r>
           </w:p>
         </w:tc>
@@ -7394,7 +7394,7 @@
                 <w:sz w:val="19"/>
                 <w:szCs w:val="19"/>
               </w:rPr>
-              <w:t>Assigned session 13 · due before session 16</w:t>
+              <w:t>Assigned session 13 · due 23:59 CT on the day of session 15</w:t>
             </w:r>
           </w:p>
         </w:tc>
@@ -7495,7 +7495,7 @@
                 <w:sz w:val="19"/>
                 <w:szCs w:val="19"/>
               </w:rPr>
-              <w:t>Advanced session 3</w:t>
+              <w:t>Advanced session 3 · submit by 23:59 CT that day</w:t>
             </w:r>
           </w:p>
         </w:tc>
@@ -7596,7 +7596,7 @@
                 <w:sz w:val="19"/>
                 <w:szCs w:val="19"/>
               </w:rPr>
-              <w:t>Assigned Advanced session 6 · due before session 11</w:t>
+              <w:t>Assigned Advanced session 6 · due 23:59 CT on the day of session 10</w:t>
             </w:r>
           </w:p>
         </w:tc>

</xml_diff>

<commit_message>
QA fixes: all 46 Books have example workpapers, Parts X/XII live in Advanced, Foundations recommended pre-work, WP3 due wording
Co-Authored-By: Claude Opus 5.5 <noreply@anthropic.com>
Claude-Session: https://claude.ai/code/session_018fWq9UNCNi5rGqwUiTA1Zk
</commit_message>
<xml_diff>
--- a/materials/00-start-here/Student-Handbook-START-HERE.docx
+++ b/materials/00-start-here/Student-Handbook-START-HERE.docx
@@ -1898,7 +1898,7 @@
                 <w:sz w:val="19"/>
                 <w:szCs w:val="19"/>
               </w:rPr>
-              <w:t xml:space="preserve">Controls Theory prerequisite (11 topics + 49-question exam, 60% to pass) · optional Foundations 101–108 if you are new to SAP</w:t>
+              <w:t>Controls Theory prerequisite (11 topics + 49-question exam, 60% to pass) · Foundations 101–108 as recommended pre-work (essential if you are new to SAP)</w:t>
             </w:r>
           </w:p>
         </w:tc>
@@ -4541,7 +4541,7 @@
                 <w:sz w:val="18"/>
                 <w:szCs w:val="18"/>
               </w:rPr>
-              <w:t>Workpaper 3 due · returned marked within a week · Intermediate certificate</w:t>
+              <w:t>Workpaper 3 already in (due 23:59 CT on session 15 day) · returned marked within a week · Intermediate certificate</w:t>
             </w:r>
           </w:p>
         </w:tc>

</xml_diff>

<commit_message>
Classes of up to 10: two trainees defend per class; panel 6 minutes per trainee
Co-Authored-By: Claude Opus 5.5 <noreply@anthropic.com>
Claude-Session: https://claude.ai/code/session_018fWq9UNCNi5rGqwUiTA1Zk
</commit_message>
<xml_diff>
--- a/materials/00-start-here/Student-Handbook-START-HERE.docx
+++ b/materials/00-start-here/Student-Handbook-START-HERE.docx
@@ -1584,7 +1584,7 @@
                 <w:sz w:val="19"/>
                 <w:szCs w:val="19"/>
               </w:rPr>
-              <w:t>One trainee presents the conclusion and the facilitator pushes back as a reviewer would. Everyone takes turns across each level</w:t>
+              <w:t>Two trainees present their conclusions, about 7 minutes each, and the facilitator pushes back as a reviewer would. Everyone takes turns across each level</w:t>
             </w:r>
           </w:p>
         </w:tc>
@@ -2109,7 +2109,7 @@
                 <w:sz w:val="19"/>
                 <w:szCs w:val="19"/>
               </w:rPr>
-              <w:t xml:space="preserve">5 trainees per slot</w:t>
+              <w:t>Up to 10 trainees per slot</w:t>
             </w:r>
           </w:p>
         </w:tc>

</xml_diff>